<commit_message>
worked on site, ready
</commit_message>
<xml_diff>
--- a/SDS_learning_diary_template.docx
+++ b/SDS_learning_diary_template.docx
@@ -1,10 +1,10 @@
 
 <file path=word/document.xml><?xml version="1.0" encoding="utf-8"?>
-<w:document xmlns:wpc="http://schemas.microsoft.com/office/word/2010/wordprocessingCanvas" xmlns:cx="http://schemas.microsoft.com/office/drawing/2014/chartex" xmlns:cx1="http://schemas.microsoft.com/office/drawing/2015/9/8/chartex" xmlns:cx2="http://schemas.microsoft.com/office/drawing/2015/10/21/chartex" xmlns:cx3="http://schemas.microsoft.com/office/drawing/2016/5/9/chartex" xmlns:cx4="http://schemas.microsoft.com/office/drawing/2016/5/10/chartex" xmlns:cx5="http://schemas.microsoft.com/office/drawing/2016/5/11/chartex" xmlns:cx6="http://schemas.microsoft.com/office/drawing/2016/5/12/chartex" xmlns:cx7="http://schemas.microsoft.com/office/drawing/2016/5/13/chartex" xmlns:cx8="http://schemas.microsoft.com/office/drawing/2016/5/14/chartex" xmlns:mc="http://schemas.openxmlformats.org/markup-compatibility/2006" xmlns:aink="http://schemas.microsoft.com/office/drawing/2016/ink" xmlns:am3d="http://schemas.microsoft.com/office/drawing/2017/model3d" xmlns:o="urn:schemas-microsoft-com:office:office" xmlns:oel="http://schemas.microsoft.com/office/2019/extlst" xmlns:r="http://schemas.openxmlformats.org/officeDocument/2006/relationships" xmlns:m="http://schemas.openxmlformats.org/officeDocument/2006/math" xmlns:v="urn:schemas-microsoft-com:vml" xmlns:wp14="http://schemas.microsoft.com/office/word/2010/wordprocessingDrawing" xmlns:wp="http://schemas.openxmlformats.org/drawingml/2006/wordprocessingDrawing" xmlns:w10="urn:schemas-microsoft-com:office:word" xmlns:w="http://schemas.openxmlformats.org/wordprocessingml/2006/main" xmlns:w14="http://schemas.microsoft.com/office/word/2010/wordml" xmlns:w15="http://schemas.microsoft.com/office/word/2012/wordml" xmlns:w16cex="http://schemas.microsoft.com/office/word/2018/wordml/cex" xmlns:w16cid="http://schemas.microsoft.com/office/word/2016/wordml/cid" xmlns:w16="http://schemas.microsoft.com/office/word/2018/wordml" xmlns:w16sdtdh="http://schemas.microsoft.com/office/word/2020/wordml/sdtdatahash" xmlns:w16se="http://schemas.microsoft.com/office/word/2015/wordml/symex" xmlns:wpg="http://schemas.microsoft.com/office/word/2010/wordprocessingGroup" xmlns:wpi="http://schemas.microsoft.com/office/word/2010/wordprocessingInk" xmlns:wne="http://schemas.microsoft.com/office/word/2006/wordml" xmlns:wps="http://schemas.microsoft.com/office/word/2010/wordprocessingShape" mc:Ignorable="w14 w15 w16se w16cid w16 w16cex w16sdtdh wp14">
+<w:document xmlns:wpc="http://schemas.microsoft.com/office/word/2010/wordprocessingCanvas" xmlns:cx="http://schemas.microsoft.com/office/drawing/2014/chartex" xmlns:cx1="http://schemas.microsoft.com/office/drawing/2015/9/8/chartex" xmlns:cx2="http://schemas.microsoft.com/office/drawing/2015/10/21/chartex" xmlns:cx3="http://schemas.microsoft.com/office/drawing/2016/5/9/chartex" xmlns:cx4="http://schemas.microsoft.com/office/drawing/2016/5/10/chartex" xmlns:cx5="http://schemas.microsoft.com/office/drawing/2016/5/11/chartex" xmlns:cx6="http://schemas.microsoft.com/office/drawing/2016/5/12/chartex" xmlns:cx7="http://schemas.microsoft.com/office/drawing/2016/5/13/chartex" xmlns:cx8="http://schemas.microsoft.com/office/drawing/2016/5/14/chartex" xmlns:mc="http://schemas.openxmlformats.org/markup-compatibility/2006" xmlns:aink="http://schemas.microsoft.com/office/drawing/2016/ink" xmlns:am3d="http://schemas.microsoft.com/office/drawing/2017/model3d" xmlns:o="urn:schemas-microsoft-com:office:office" xmlns:oel="http://schemas.microsoft.com/office/2019/extlst" xmlns:r="http://schemas.openxmlformats.org/officeDocument/2006/relationships" xmlns:m="http://schemas.openxmlformats.org/officeDocument/2006/math" xmlns:v="urn:schemas-microsoft-com:vml" xmlns:wp14="http://schemas.microsoft.com/office/word/2010/wordprocessingDrawing" xmlns:wp="http://schemas.openxmlformats.org/drawingml/2006/wordprocessingDrawing" xmlns:w10="urn:schemas-microsoft-com:office:word" xmlns:w="http://schemas.openxmlformats.org/wordprocessingml/2006/main" xmlns:w14="http://schemas.microsoft.com/office/word/2010/wordml" xmlns:w15="http://schemas.microsoft.com/office/word/2012/wordml" xmlns:w16cex="http://schemas.microsoft.com/office/word/2018/wordml/cex" xmlns:w16cid="http://schemas.microsoft.com/office/word/2016/wordml/cid" xmlns:w16="http://schemas.microsoft.com/office/word/2018/wordml" xmlns:w16du="http://schemas.microsoft.com/office/word/2023/wordml/word16du" xmlns:w16sdtdh="http://schemas.microsoft.com/office/word/2020/wordml/sdtdatahash" xmlns:w16sdtfl="http://schemas.microsoft.com/office/word/2024/wordml/sdtformatlock" xmlns:w16se="http://schemas.microsoft.com/office/word/2015/wordml/symex" xmlns:wpg="http://schemas.microsoft.com/office/word/2010/wordprocessingGroup" xmlns:wpi="http://schemas.microsoft.com/office/word/2010/wordprocessingInk" xmlns:wne="http://schemas.microsoft.com/office/word/2006/wordml" xmlns:wps="http://schemas.microsoft.com/office/word/2010/wordprocessingShape" mc:Ignorable="w14 w15 w16se w16cid w16 w16cex w16sdtdh w16sdtfl w16du wp14">
   <w:body>
     <w:p>
       <w:pPr>
-        <w:pStyle w:val="Title"/>
+        <w:pStyle w:val="Otsikko"/>
         <w:jc w:val="both"/>
         <w:rPr>
           <w:rFonts w:ascii="Times New Roman" w:hAnsi="Times New Roman" w:cs="Times New Roman"/>
@@ -73,7 +73,7 @@
     </w:p>
     <w:p>
       <w:pPr>
-        <w:pStyle w:val="Title"/>
+        <w:pStyle w:val="Otsikko"/>
         <w:jc w:val="both"/>
         <w:rPr>
           <w:rFonts w:ascii="Times New Roman" w:hAnsi="Times New Roman" w:cs="Times New Roman"/>
@@ -91,9 +91,13 @@
           <w:szCs w:val="24"/>
           <w:lang w:val="en-US"/>
         </w:rPr>
-        <w:t>Name of your school goes here (School</w:t>
-      </w:r>
-      <w:r>
+        <w:t>School of Engineering Sciences</w:t>
+      </w:r>
+    </w:p>
+    <w:p>
+      <w:pPr>
+        <w:pStyle w:val="Otsikko"/>
+        <w:jc w:val="both"/>
         <w:rPr>
           <w:rFonts w:ascii="Times New Roman" w:hAnsi="Times New Roman" w:cs="Times New Roman"/>
           <w:b w:val="0"/>
@@ -101,9 +105,56 @@
           <w:szCs w:val="24"/>
           <w:lang w:val="en-US"/>
         </w:rPr>
-        <w:t xml:space="preserve"> of Business and Management</w:t>
-      </w:r>
-      <w:r>
+      </w:pPr>
+    </w:p>
+    <w:p>
+      <w:pPr>
+        <w:pStyle w:val="Otsikko"/>
+        <w:jc w:val="left"/>
+        <w:rPr>
+          <w:sz w:val="24"/>
+          <w:szCs w:val="24"/>
+          <w:lang w:val="en-US"/>
+        </w:rPr>
+      </w:pPr>
+    </w:p>
+    <w:p>
+      <w:pPr>
+        <w:pStyle w:val="Otsikko"/>
+        <w:jc w:val="left"/>
+        <w:rPr>
+          <w:sz w:val="24"/>
+          <w:szCs w:val="24"/>
+          <w:lang w:val="en-US"/>
+        </w:rPr>
+      </w:pPr>
+    </w:p>
+    <w:p>
+      <w:pPr>
+        <w:pStyle w:val="Otsikko"/>
+        <w:jc w:val="left"/>
+        <w:rPr>
+          <w:sz w:val="24"/>
+          <w:szCs w:val="24"/>
+          <w:lang w:val="en-US"/>
+        </w:rPr>
+      </w:pPr>
+    </w:p>
+    <w:p>
+      <w:pPr>
+        <w:pStyle w:val="Otsikko"/>
+        <w:jc w:val="left"/>
+        <w:rPr>
+          <w:sz w:val="24"/>
+          <w:szCs w:val="24"/>
+          <w:lang w:val="en-US"/>
+        </w:rPr>
+      </w:pPr>
+    </w:p>
+    <w:p>
+      <w:pPr>
+        <w:pStyle w:val="Otsikko"/>
+        <w:jc w:val="both"/>
         <w:rPr>
           <w:rFonts w:ascii="Times New Roman" w:hAnsi="Times New Roman" w:cs="Times New Roman"/>
           <w:b w:val="0"/>
@@ -111,13 +162,8 @@
           <w:szCs w:val="24"/>
           <w:lang w:val="en-US"/>
         </w:rPr>
-        <w:t>)</w:t>
-      </w:r>
-    </w:p>
-    <w:p>
-      <w:pPr>
-        <w:pStyle w:val="Title"/>
-        <w:jc w:val="both"/>
+      </w:pPr>
+      <w:r>
         <w:rPr>
           <w:rFonts w:ascii="Times New Roman" w:hAnsi="Times New Roman" w:cs="Times New Roman"/>
           <w:b w:val="0"/>
@@ -125,56 +171,9 @@
           <w:szCs w:val="24"/>
           <w:lang w:val="en-US"/>
         </w:rPr>
-      </w:pPr>
-    </w:p>
-    <w:p>
-      <w:pPr>
-        <w:pStyle w:val="Title"/>
-        <w:jc w:val="left"/>
-        <w:rPr>
-          <w:sz w:val="24"/>
-          <w:szCs w:val="24"/>
-          <w:lang w:val="en-US"/>
-        </w:rPr>
-      </w:pPr>
-    </w:p>
-    <w:p>
-      <w:pPr>
-        <w:pStyle w:val="Title"/>
-        <w:jc w:val="left"/>
-        <w:rPr>
-          <w:sz w:val="24"/>
-          <w:szCs w:val="24"/>
-          <w:lang w:val="en-US"/>
-        </w:rPr>
-      </w:pPr>
-    </w:p>
-    <w:p>
-      <w:pPr>
-        <w:pStyle w:val="Title"/>
-        <w:jc w:val="left"/>
-        <w:rPr>
-          <w:sz w:val="24"/>
-          <w:szCs w:val="24"/>
-          <w:lang w:val="en-US"/>
-        </w:rPr>
-      </w:pPr>
-    </w:p>
-    <w:p>
-      <w:pPr>
-        <w:pStyle w:val="Title"/>
-        <w:jc w:val="left"/>
-        <w:rPr>
-          <w:sz w:val="24"/>
-          <w:szCs w:val="24"/>
-          <w:lang w:val="en-US"/>
-        </w:rPr>
-      </w:pPr>
-    </w:p>
-    <w:p>
-      <w:pPr>
-        <w:pStyle w:val="Title"/>
-        <w:jc w:val="both"/>
+        <w:t>Software Development Skills</w:t>
+      </w:r>
+      <w:r>
         <w:rPr>
           <w:rFonts w:ascii="Times New Roman" w:hAnsi="Times New Roman" w:cs="Times New Roman"/>
           <w:b w:val="0"/>
@@ -182,8 +181,13 @@
           <w:szCs w:val="24"/>
           <w:lang w:val="en-US"/>
         </w:rPr>
-      </w:pPr>
-      <w:r>
+        <w:t xml:space="preserve"> Front-End, Online course</w:t>
+      </w:r>
+    </w:p>
+    <w:p>
+      <w:pPr>
+        <w:pStyle w:val="Otsikko"/>
+        <w:jc w:val="left"/>
         <w:rPr>
           <w:rFonts w:ascii="Times New Roman" w:hAnsi="Times New Roman" w:cs="Times New Roman"/>
           <w:b w:val="0"/>
@@ -191,9 +195,33 @@
           <w:szCs w:val="24"/>
           <w:lang w:val="en-US"/>
         </w:rPr>
-        <w:t>Software</w:t>
-      </w:r>
-      <w:r>
+      </w:pPr>
+    </w:p>
+    <w:p>
+      <w:pPr>
+        <w:pStyle w:val="Otsikko"/>
+        <w:jc w:val="left"/>
+        <w:rPr>
+          <w:rFonts w:ascii="Times New Roman" w:hAnsi="Times New Roman" w:cs="Times New Roman"/>
+          <w:sz w:val="24"/>
+          <w:szCs w:val="24"/>
+          <w:lang w:val="en-US"/>
+        </w:rPr>
+      </w:pPr>
+      <w:r>
+        <w:rPr>
+          <w:rFonts w:ascii="Times New Roman" w:hAnsi="Times New Roman" w:cs="Times New Roman"/>
+          <w:sz w:val="24"/>
+          <w:szCs w:val="24"/>
+          <w:lang w:val="en-US"/>
+        </w:rPr>
+        <w:t>Lauri Metso, 001830884</w:t>
+      </w:r>
+    </w:p>
+    <w:p>
+      <w:pPr>
+        <w:pStyle w:val="Otsikko"/>
+        <w:jc w:val="left"/>
         <w:rPr>
           <w:rFonts w:ascii="Times New Roman" w:hAnsi="Times New Roman" w:cs="Times New Roman"/>
           <w:b w:val="0"/>
@@ -201,9 +229,12 @@
           <w:szCs w:val="24"/>
           <w:lang w:val="en-US"/>
         </w:rPr>
-        <w:t xml:space="preserve"> Development Skills</w:t>
-      </w:r>
-      <w:r>
+      </w:pPr>
+    </w:p>
+    <w:p>
+      <w:pPr>
+        <w:pStyle w:val="Otsikko"/>
+        <w:jc w:val="left"/>
         <w:rPr>
           <w:rFonts w:ascii="Times New Roman" w:hAnsi="Times New Roman" w:cs="Times New Roman"/>
           <w:b w:val="0"/>
@@ -211,115 +242,35 @@
           <w:szCs w:val="24"/>
           <w:lang w:val="en-US"/>
         </w:rPr>
-        <w:t xml:space="preserve"> Front-End, </w:t>
-      </w:r>
-      <w:r>
+      </w:pPr>
+    </w:p>
+    <w:p>
+      <w:pPr>
+        <w:pStyle w:val="Otsikko"/>
+        <w:jc w:val="left"/>
         <w:rPr>
           <w:rFonts w:ascii="Times New Roman" w:hAnsi="Times New Roman" w:cs="Times New Roman"/>
-          <w:b w:val="0"/>
-          <w:sz w:val="24"/>
-          <w:szCs w:val="24"/>
-          <w:lang w:val="en-US"/>
-        </w:rPr>
-        <w:t>Online course</w:t>
-      </w:r>
-    </w:p>
-    <w:p>
-      <w:pPr>
-        <w:pStyle w:val="Title"/>
-        <w:jc w:val="left"/>
+          <w:lang w:val="en-US"/>
+        </w:rPr>
+      </w:pPr>
+      <w:r>
         <w:rPr>
           <w:rFonts w:ascii="Times New Roman" w:hAnsi="Times New Roman" w:cs="Times New Roman"/>
-          <w:b w:val="0"/>
-          <w:sz w:val="24"/>
-          <w:szCs w:val="24"/>
-          <w:lang w:val="en-US"/>
-        </w:rPr>
-      </w:pPr>
-    </w:p>
-    <w:p>
-      <w:pPr>
-        <w:pStyle w:val="Title"/>
-        <w:jc w:val="left"/>
+          <w:lang w:val="en-US"/>
+        </w:rPr>
+        <w:t xml:space="preserve">LEARNING DIARY, </w:t>
+      </w:r>
+      <w:r>
         <w:rPr>
           <w:rFonts w:ascii="Times New Roman" w:hAnsi="Times New Roman" w:cs="Times New Roman"/>
-          <w:sz w:val="24"/>
-          <w:szCs w:val="24"/>
-          <w:lang w:val="en-US"/>
-        </w:rPr>
-      </w:pPr>
-      <w:r>
-        <w:rPr>
-          <w:rFonts w:ascii="Times New Roman" w:hAnsi="Times New Roman" w:cs="Times New Roman"/>
-          <w:sz w:val="24"/>
-          <w:szCs w:val="24"/>
-          <w:lang w:val="en-US"/>
-        </w:rPr>
-        <w:t>&lt;Insert name here&gt;, &lt;Insert s</w:t>
-      </w:r>
-      <w:r>
-        <w:rPr>
-          <w:rFonts w:ascii="Times New Roman" w:hAnsi="Times New Roman" w:cs="Times New Roman"/>
-          <w:sz w:val="24"/>
-          <w:szCs w:val="24"/>
-          <w:lang w:val="en-US"/>
-        </w:rPr>
-        <w:t>tudent number here&gt;</w:t>
-      </w:r>
-    </w:p>
-    <w:p>
-      <w:pPr>
-        <w:pStyle w:val="Title"/>
-        <w:jc w:val="left"/>
-        <w:rPr>
-          <w:rFonts w:ascii="Times New Roman" w:hAnsi="Times New Roman" w:cs="Times New Roman"/>
-          <w:b w:val="0"/>
-          <w:sz w:val="24"/>
-          <w:szCs w:val="24"/>
-          <w:lang w:val="en-US"/>
-        </w:rPr>
-      </w:pPr>
-    </w:p>
-    <w:p>
-      <w:pPr>
-        <w:pStyle w:val="Title"/>
-        <w:jc w:val="left"/>
-        <w:rPr>
-          <w:rFonts w:ascii="Times New Roman" w:hAnsi="Times New Roman" w:cs="Times New Roman"/>
-          <w:b w:val="0"/>
-          <w:sz w:val="24"/>
-          <w:szCs w:val="24"/>
-          <w:lang w:val="en-US"/>
-        </w:rPr>
-      </w:pPr>
-    </w:p>
-    <w:p>
-      <w:pPr>
-        <w:pStyle w:val="Title"/>
-        <w:jc w:val="left"/>
-        <w:rPr>
-          <w:rFonts w:ascii="Times New Roman" w:hAnsi="Times New Roman" w:cs="Times New Roman"/>
-          <w:lang w:val="en-US"/>
-        </w:rPr>
-      </w:pPr>
-      <w:r>
-        <w:rPr>
-          <w:rFonts w:ascii="Times New Roman" w:hAnsi="Times New Roman" w:cs="Times New Roman"/>
-          <w:lang w:val="en-US"/>
-        </w:rPr>
-        <w:t xml:space="preserve">LEARNING DIARY, </w:t>
-      </w:r>
-      <w:r>
-        <w:rPr>
-          <w:rFonts w:ascii="Times New Roman" w:hAnsi="Times New Roman" w:cs="Times New Roman"/>
-          <w:lang w:val="en-US"/>
-        </w:rPr>
-        <w:t>&lt;CHOSEN MODULE NAME&gt; MODULE</w:t>
-      </w:r>
-    </w:p>
-    <w:p>
-      <w:pPr>
-        <w:pStyle w:val="Heading5"/>
+          <w:lang w:val="en-US"/>
+        </w:rPr>
+        <w:t>FRONT-END MODULE</w:t>
+      </w:r>
+    </w:p>
+    <w:p>
+      <w:pPr>
+        <w:pStyle w:val="Otsikko5"/>
         <w:numPr>
           <w:ilvl w:val="0"/>
           <w:numId w:val="0"/>
@@ -345,183 +296,265 @@
           <w:lang w:val="en-US"/>
         </w:rPr>
       </w:pPr>
-      <w:proofErr w:type="gramStart"/>
-      <w:r>
-        <w:rPr>
-          <w:lang w:val="en-US"/>
-        </w:rPr>
-        <w:t>Date :</w:t>
-      </w:r>
-      <w:proofErr w:type="gramEnd"/>
-      <w:r>
-        <w:rPr>
-          <w:lang w:val="en-US"/>
-        </w:rPr>
-        <w:t xml:space="preserve"> ( date here)</w:t>
-      </w:r>
-    </w:p>
-    <w:p>
-      <w:pPr>
-        <w:rPr>
-          <w:lang w:val="en-US"/>
-        </w:rPr>
-      </w:pPr>
-      <w:proofErr w:type="gramStart"/>
-      <w:r>
-        <w:rPr>
-          <w:lang w:val="en-US"/>
-        </w:rPr>
-        <w:t>Activity :</w:t>
-      </w:r>
-      <w:proofErr w:type="gramEnd"/>
-      <w:r>
-        <w:rPr>
-          <w:lang w:val="en-US"/>
-        </w:rPr>
-        <w:t xml:space="preserve"> Video lecture or other activity details here</w:t>
-      </w:r>
-    </w:p>
-    <w:p>
-      <w:pPr>
-        <w:rPr>
-          <w:lang w:val="en-US"/>
-        </w:rPr>
-      </w:pPr>
-      <w:r>
-        <w:rPr>
-          <w:lang w:val="en-US"/>
-        </w:rPr>
-        <w:t>Learning outcome: what did I learn</w:t>
-      </w:r>
-    </w:p>
-    <w:p>
-      <w:pPr>
-        <w:rPr>
-          <w:lang w:val="en-US"/>
-        </w:rPr>
-      </w:pPr>
-    </w:p>
-    <w:p>
-      <w:pPr>
-        <w:rPr>
-          <w:lang w:val="en-US"/>
-        </w:rPr>
-      </w:pPr>
-    </w:p>
-    <w:p>
-      <w:pPr>
-        <w:rPr>
-          <w:lang w:val="en-US"/>
-        </w:rPr>
-      </w:pPr>
-      <w:proofErr w:type="gramStart"/>
-      <w:r>
-        <w:rPr>
-          <w:lang w:val="en-US"/>
-        </w:rPr>
-        <w:t>Date :</w:t>
-      </w:r>
-      <w:proofErr w:type="gramEnd"/>
-      <w:r>
-        <w:rPr>
-          <w:lang w:val="en-US"/>
-        </w:rPr>
-        <w:t xml:space="preserve"> ( date here)</w:t>
-      </w:r>
-    </w:p>
-    <w:p>
-      <w:pPr>
-        <w:rPr>
-          <w:lang w:val="en-US"/>
-        </w:rPr>
-      </w:pPr>
-      <w:proofErr w:type="gramStart"/>
-      <w:r>
-        <w:rPr>
-          <w:lang w:val="en-US"/>
-        </w:rPr>
-        <w:t>Activity :</w:t>
-      </w:r>
-      <w:proofErr w:type="gramEnd"/>
-      <w:r>
-        <w:rPr>
-          <w:lang w:val="en-US"/>
-        </w:rPr>
-        <w:t xml:space="preserve"> Video lecture or other activity details here</w:t>
-      </w:r>
-    </w:p>
-    <w:p>
-      <w:pPr>
-        <w:rPr>
-          <w:lang w:val="en-US"/>
-        </w:rPr>
-      </w:pPr>
-      <w:r>
-        <w:rPr>
-          <w:lang w:val="en-US"/>
-        </w:rPr>
-        <w:t>Learning outcome: what did I learn</w:t>
-      </w:r>
-    </w:p>
-    <w:p>
-      <w:pPr>
-        <w:rPr>
-          <w:lang w:val="en-US"/>
-        </w:rPr>
-      </w:pPr>
-    </w:p>
-    <w:p>
-      <w:pPr>
-        <w:rPr>
-          <w:lang w:val="en-US"/>
-        </w:rPr>
-      </w:pPr>
-    </w:p>
-    <w:p>
-      <w:pPr>
-        <w:rPr>
-          <w:lang w:val="en-US"/>
-        </w:rPr>
-      </w:pPr>
-    </w:p>
-    <w:p>
-      <w:pPr>
-        <w:rPr>
-          <w:lang w:val="en-US"/>
-        </w:rPr>
-      </w:pPr>
-    </w:p>
-    <w:p>
-      <w:pPr>
-        <w:rPr>
-          <w:lang w:val="en-US"/>
-        </w:rPr>
-      </w:pPr>
-    </w:p>
-    <w:p>
-      <w:pPr>
-        <w:rPr>
-          <w:lang w:val="en-US"/>
-        </w:rPr>
-      </w:pPr>
-    </w:p>
-    <w:p>
-      <w:pPr>
-        <w:rPr>
-          <w:lang w:val="en-US"/>
-        </w:rPr>
-      </w:pPr>
-    </w:p>
-    <w:p>
-      <w:pPr>
-        <w:rPr>
-          <w:lang w:val="en-US"/>
-        </w:rPr>
-      </w:pPr>
-    </w:p>
-    <w:p>
-      <w:pPr>
-        <w:pStyle w:val="IndexHeading"/>
+      <w:r>
+        <w:rPr>
+          <w:lang w:val="en-US"/>
+        </w:rPr>
+        <w:t>Date : 24.2.2026</w:t>
+      </w:r>
+    </w:p>
+    <w:p>
+      <w:pPr>
+        <w:rPr>
+          <w:lang w:val="en-US"/>
+        </w:rPr>
+      </w:pPr>
+      <w:r>
+        <w:rPr>
+          <w:lang w:val="en-US"/>
+        </w:rPr>
+        <w:t>Activity : Video lecture, coding</w:t>
+      </w:r>
+    </w:p>
+    <w:p>
+      <w:pPr>
+        <w:rPr>
+          <w:lang w:val="en-US"/>
+        </w:rPr>
+      </w:pPr>
+      <w:r>
+        <w:rPr>
+          <w:lang w:val="en-US"/>
+        </w:rPr>
+        <w:t xml:space="preserve">Learning outcome: Set up environment, refreshed my memory on HTML with lectures part 1 and part 2. </w:t>
+      </w:r>
+    </w:p>
+    <w:p>
+      <w:pPr>
+        <w:rPr>
+          <w:lang w:val="en-US"/>
+        </w:rPr>
+      </w:pPr>
+    </w:p>
+    <w:p>
+      <w:pPr>
+        <w:rPr>
+          <w:lang w:val="en-US"/>
+        </w:rPr>
+      </w:pPr>
+    </w:p>
+    <w:p>
+      <w:pPr>
+        <w:rPr>
+          <w:lang w:val="en-US"/>
+        </w:rPr>
+      </w:pPr>
+      <w:r>
+        <w:rPr>
+          <w:lang w:val="en-US"/>
+        </w:rPr>
+        <w:t>Date : 25.2.2026</w:t>
+      </w:r>
+    </w:p>
+    <w:p>
+      <w:pPr>
+        <w:rPr>
+          <w:lang w:val="en-US"/>
+        </w:rPr>
+      </w:pPr>
+      <w:r>
+        <w:rPr>
+          <w:lang w:val="en-US"/>
+        </w:rPr>
+        <w:t xml:space="preserve">Activity : Video lecture </w:t>
+      </w:r>
+    </w:p>
+    <w:p>
+      <w:pPr>
+        <w:rPr>
+          <w:lang w:val="en-US"/>
+        </w:rPr>
+      </w:pPr>
+      <w:r>
+        <w:rPr>
+          <w:lang w:val="en-US"/>
+        </w:rPr>
+        <w:t xml:space="preserve">Learning outcome: Set up navbar and basic </w:t>
+      </w:r>
+      <w:proofErr w:type="spellStart"/>
+      <w:r>
+        <w:rPr>
+          <w:lang w:val="en-US"/>
+        </w:rPr>
+        <w:t>css</w:t>
+      </w:r>
+      <w:proofErr w:type="spellEnd"/>
+    </w:p>
+    <w:p>
+      <w:pPr>
+        <w:rPr>
+          <w:lang w:val="en-US"/>
+        </w:rPr>
+      </w:pPr>
+    </w:p>
+    <w:p>
+      <w:pPr>
+        <w:rPr>
+          <w:lang w:val="en-US"/>
+        </w:rPr>
+      </w:pPr>
+    </w:p>
+    <w:p>
+      <w:pPr>
+        <w:rPr>
+          <w:lang w:val="en-US"/>
+        </w:rPr>
+      </w:pPr>
+      <w:r>
+        <w:rPr>
+          <w:lang w:val="en-US"/>
+        </w:rPr>
+        <w:t>Date: 27.2.2026</w:t>
+      </w:r>
+    </w:p>
+    <w:p>
+      <w:pPr>
+        <w:rPr>
+          <w:lang w:val="en-US"/>
+        </w:rPr>
+      </w:pPr>
+      <w:r>
+        <w:rPr>
+          <w:lang w:val="en-US"/>
+        </w:rPr>
+        <w:t>Activity: Video lecture</w:t>
+      </w:r>
+    </w:p>
+    <w:p>
+      <w:pPr>
+        <w:rPr>
+          <w:lang w:val="en-US"/>
+        </w:rPr>
+      </w:pPr>
+      <w:r>
+        <w:rPr>
+          <w:lang w:val="en-US"/>
+        </w:rPr>
+        <w:t>Learning outcome: Set up buttons and utility classes</w:t>
+      </w:r>
+    </w:p>
+    <w:p>
+      <w:pPr>
+        <w:rPr>
+          <w:lang w:val="en-US"/>
+        </w:rPr>
+      </w:pPr>
+    </w:p>
+    <w:p>
+      <w:pPr>
+        <w:rPr>
+          <w:lang w:val="en-US"/>
+        </w:rPr>
+      </w:pPr>
+    </w:p>
+    <w:p>
+      <w:pPr>
+        <w:rPr>
+          <w:lang w:val="en-US"/>
+        </w:rPr>
+      </w:pPr>
+      <w:r>
+        <w:rPr>
+          <w:lang w:val="en-US"/>
+        </w:rPr>
+        <w:t>Date: 2.3.2026</w:t>
+      </w:r>
+    </w:p>
+    <w:p>
+      <w:pPr>
+        <w:rPr>
+          <w:lang w:val="en-US"/>
+        </w:rPr>
+      </w:pPr>
+      <w:r>
+        <w:rPr>
+          <w:lang w:val="en-US"/>
+        </w:rPr>
+        <w:t>Activity: Video lecture</w:t>
+      </w:r>
+    </w:p>
+    <w:p>
+      <w:pPr>
+        <w:rPr>
+          <w:lang w:val="en-US"/>
+        </w:rPr>
+      </w:pPr>
+      <w:r>
+        <w:rPr>
+          <w:lang w:val="en-US"/>
+        </w:rPr>
+        <w:t xml:space="preserve">Learning outcome: Went more in-depth on </w:t>
+      </w:r>
+      <w:proofErr w:type="spellStart"/>
+      <w:r>
+        <w:rPr>
+          <w:lang w:val="en-US"/>
+        </w:rPr>
+        <w:t>css</w:t>
+      </w:r>
+      <w:proofErr w:type="spellEnd"/>
+      <w:r>
+        <w:rPr>
+          <w:lang w:val="en-US"/>
+        </w:rPr>
+        <w:t xml:space="preserve"> and continued working on the task list</w:t>
+      </w:r>
+    </w:p>
+    <w:p>
+      <w:pPr>
+        <w:rPr>
+          <w:lang w:val="en-US"/>
+        </w:rPr>
+      </w:pPr>
+    </w:p>
+    <w:p>
+      <w:pPr>
+        <w:rPr>
+          <w:lang w:val="en-US"/>
+        </w:rPr>
+      </w:pPr>
+    </w:p>
+    <w:p>
+      <w:pPr>
+        <w:rPr>
+          <w:lang w:val="en-US"/>
+        </w:rPr>
+      </w:pPr>
+    </w:p>
+    <w:p>
+      <w:pPr>
+        <w:rPr>
+          <w:lang w:val="en-US"/>
+        </w:rPr>
+      </w:pPr>
+    </w:p>
+    <w:p>
+      <w:pPr>
+        <w:rPr>
+          <w:lang w:val="en-US"/>
+        </w:rPr>
+      </w:pPr>
+    </w:p>
+    <w:p>
+      <w:pPr>
+        <w:rPr>
+          <w:lang w:val="en-US"/>
+        </w:rPr>
+      </w:pPr>
+    </w:p>
+    <w:p>
+      <w:pPr>
+        <w:pStyle w:val="Hakemistonotsikko"/>
         <w:spacing w:line="360" w:lineRule="auto"/>
         <w:rPr>
           <w:lang w:val="en-US"/>
@@ -530,7 +563,7 @@
     </w:p>
     <w:p>
       <w:pPr>
-        <w:pStyle w:val="IndexHeading"/>
+        <w:pStyle w:val="Hakemistonotsikko"/>
         <w:spacing w:line="360" w:lineRule="auto"/>
         <w:rPr>
           <w:lang w:val="en-US"/>
@@ -539,15 +572,15 @@
     </w:p>
     <w:p>
       <w:pPr>
-        <w:pStyle w:val="IndexHeading"/>
-        <w:rPr>
-          <w:lang w:val="en-US"/>
-        </w:rPr>
-      </w:pPr>
-    </w:p>
-    <w:p>
-      <w:pPr>
-        <w:pStyle w:val="BodyText"/>
+        <w:pStyle w:val="Hakemistonotsikko"/>
+        <w:rPr>
+          <w:lang w:val="en-US"/>
+        </w:rPr>
+      </w:pPr>
+    </w:p>
+    <w:p>
+      <w:pPr>
+        <w:pStyle w:val="Leipteksti"/>
         <w:rPr>
           <w:b/>
           <w:bCs/>
@@ -564,447 +597,277 @@
           <w:szCs w:val="28"/>
           <w:lang w:val="en-US"/>
         </w:rPr>
-        <w:br w:type="page"/>
-      </w:r>
-      <w:r>
+        <w:t>LEARNING DIARY</w:t>
+      </w:r>
+    </w:p>
+    <w:p>
+      <w:pPr>
+        <w:pStyle w:val="Leipteksti"/>
         <w:rPr>
           <w:b/>
           <w:bCs/>
-          <w:sz w:val="28"/>
-          <w:szCs w:val="28"/>
-          <w:lang w:val="en-US"/>
-        </w:rPr>
-        <w:lastRenderedPageBreak/>
-        <w:t>LEARNING DIARY</w:t>
-      </w:r>
-    </w:p>
-    <w:p>
-      <w:pPr>
-        <w:pStyle w:val="BodyText"/>
-        <w:rPr>
-          <w:b/>
-          <w:bCs/>
-          <w:lang w:val="en-US"/>
-        </w:rPr>
-      </w:pPr>
-    </w:p>
-    <w:p>
-      <w:pPr>
-        <w:pStyle w:val="BodyText"/>
-        <w:rPr>
-          <w:b/>
-          <w:bCs/>
-          <w:lang w:val="en-US"/>
-        </w:rPr>
-      </w:pPr>
-      <w:r>
-        <w:rPr>
-          <w:b/>
-          <w:bCs/>
-          <w:lang w:val="en-US"/>
-        </w:rPr>
-        <w:t>EXAMPLE STYLE 1</w:t>
-      </w:r>
-    </w:p>
-    <w:p>
-      <w:pPr>
-        <w:pStyle w:val="BodyText"/>
-        <w:rPr>
-          <w:lang w:val="en-US"/>
-        </w:rPr>
-      </w:pPr>
-      <w:r>
-        <w:rPr>
-          <w:lang w:val="en-US"/>
-        </w:rPr>
-        <w:t>10.9.2018</w:t>
+          <w:lang w:val="en-US"/>
+        </w:rPr>
+      </w:pPr>
+    </w:p>
+    <w:p>
+      <w:pPr>
+        <w:pStyle w:val="Leipteksti"/>
+        <w:rPr>
+          <w:lang w:val="en-US"/>
+        </w:rPr>
+      </w:pPr>
+      <w:r>
+        <w:rPr>
+          <w:lang w:val="en-US"/>
+        </w:rPr>
+        <w:t>24.2.2026</w:t>
+      </w:r>
+    </w:p>
+    <w:p>
+      <w:pPr>
+        <w:pStyle w:val="Leipteksti"/>
+        <w:rPr>
+          <w:lang w:val="en-US"/>
+        </w:rPr>
+      </w:pPr>
+      <w:r>
+        <w:rPr>
+          <w:lang w:val="en-US"/>
+        </w:rPr>
+        <w:t xml:space="preserve">Checked the general information of the course and went through the requirements. </w:t>
+      </w:r>
+      <w:proofErr w:type="gramStart"/>
+      <w:r>
+        <w:rPr>
+          <w:lang w:val="en-US"/>
+        </w:rPr>
+        <w:t>Chose</w:t>
+      </w:r>
+      <w:proofErr w:type="gramEnd"/>
+      <w:r>
+        <w:rPr>
+          <w:lang w:val="en-US"/>
+        </w:rPr>
+        <w:t xml:space="preserve"> the frontend module because it was the most interesting to me. Set up my environment with </w:t>
+      </w:r>
+      <w:proofErr w:type="gramStart"/>
+      <w:r>
+        <w:rPr>
+          <w:lang w:val="en-US"/>
+        </w:rPr>
+        <w:t>git</w:t>
+      </w:r>
+      <w:proofErr w:type="gramEnd"/>
+      <w:r>
+        <w:rPr>
+          <w:lang w:val="en-US"/>
+        </w:rPr>
+        <w:t xml:space="preserve"> and </w:t>
+      </w:r>
+      <w:proofErr w:type="spellStart"/>
+      <w:r>
+        <w:rPr>
+          <w:lang w:val="en-US"/>
+        </w:rPr>
+        <w:t>VScode</w:t>
+      </w:r>
+      <w:proofErr w:type="spellEnd"/>
+      <w:r>
+        <w:rPr>
+          <w:lang w:val="en-US"/>
+        </w:rPr>
+        <w:t xml:space="preserve">. I watched some of the HTML lectures, which refreshed my memory of it. </w:t>
+      </w:r>
+    </w:p>
+    <w:p>
+      <w:pPr>
+        <w:pStyle w:val="Leipteksti"/>
+        <w:rPr>
+          <w:lang w:val="en-US"/>
+        </w:rPr>
+      </w:pPr>
+    </w:p>
+    <w:p>
+      <w:pPr>
+        <w:pStyle w:val="Leipteksti"/>
+        <w:rPr>
+          <w:lang w:val="en-US"/>
+        </w:rPr>
+      </w:pPr>
+      <w:r>
+        <w:rPr>
+          <w:lang w:val="en-US"/>
+        </w:rPr>
+        <w:t>25.2.2026</w:t>
       </w:r>
       <w:r>
         <w:rPr>
           <w:lang w:val="en-US"/>
         </w:rPr>
         <w:br/>
-      </w:r>
-      <w:r>
-        <w:rPr>
-          <w:lang w:val="en-US"/>
-        </w:rPr>
-        <w:br/>
-        <w:t xml:space="preserve">I </w:t>
-      </w:r>
-      <w:r>
-        <w:rPr>
-          <w:lang w:val="en-US"/>
-        </w:rPr>
-        <w:t xml:space="preserve">checked </w:t>
-      </w:r>
-      <w:r>
-        <w:rPr>
-          <w:lang w:val="en-US"/>
-        </w:rPr>
-        <w:t xml:space="preserve">the general information and understood the </w:t>
-      </w:r>
-      <w:proofErr w:type="gramStart"/>
-      <w:r>
-        <w:rPr>
-          <w:lang w:val="en-US"/>
-        </w:rPr>
-        <w:t>main focus</w:t>
-      </w:r>
-      <w:proofErr w:type="gramEnd"/>
-      <w:r>
-        <w:rPr>
-          <w:lang w:val="en-US"/>
-        </w:rPr>
-        <w:t xml:space="preserve"> of t</w:t>
-      </w:r>
-      <w:r>
-        <w:rPr>
-          <w:lang w:val="en-US"/>
-        </w:rPr>
-        <w:t xml:space="preserve">he course, which is to find my passion as a software developer and create a unique project to represent my skills. I chose frontend module because it was the most interesting project offered. I’ve also tried to set up my environment, but I could not decide which code editor I would like to use.  I learned to set up a git repository and did my first commit, everything went smoothly after I clicked the banner to watch intro to GIT. </w:t>
-      </w:r>
-      <w:r>
-        <w:rPr>
-          <w:lang w:val="en-US"/>
-        </w:rPr>
-        <w:t xml:space="preserve"> </w:t>
-      </w:r>
-    </w:p>
-    <w:p>
-      <w:pPr>
-        <w:pStyle w:val="BodyText"/>
-        <w:rPr>
-          <w:lang w:val="en-US"/>
-        </w:rPr>
-      </w:pPr>
-    </w:p>
-    <w:p>
-      <w:pPr>
-        <w:pStyle w:val="BodyText"/>
-        <w:rPr>
-          <w:lang w:val="en-US"/>
-        </w:rPr>
-      </w:pPr>
-      <w:r>
-        <w:rPr>
-          <w:lang w:val="en-US"/>
-        </w:rPr>
-        <w:t>11.9.201</w:t>
-      </w:r>
-      <w:r>
-        <w:rPr>
-          <w:lang w:val="en-US"/>
-        </w:rPr>
-        <w:t>8</w:t>
-      </w:r>
-    </w:p>
-    <w:p>
-      <w:pPr>
-        <w:pStyle w:val="BodyText"/>
-        <w:rPr>
-          <w:lang w:val="en-US"/>
-        </w:rPr>
-      </w:pPr>
-      <w:r>
-        <w:rPr>
-          <w:lang w:val="en-US"/>
-        </w:rPr>
-        <w:br/>
-        <w:t xml:space="preserve">I have chosen VS Code as my code editor for this course, I learned how to set up addons by googling how to do it. I searched the web for best addons and chose the best addons that I think fits me best.  </w:t>
-      </w:r>
-      <w:r>
-        <w:rPr>
-          <w:lang w:val="en-US"/>
-        </w:rPr>
-        <w:t>I started to watch the first part of the example project to understand the technologies better.</w:t>
-      </w:r>
-    </w:p>
-    <w:p>
-      <w:pPr>
-        <w:pStyle w:val="BodyText"/>
-        <w:rPr>
-          <w:lang w:val="en-US"/>
-        </w:rPr>
-      </w:pPr>
-    </w:p>
-    <w:p>
-      <w:pPr>
-        <w:pStyle w:val="BodyText"/>
-        <w:rPr>
-          <w:lang w:val="en-US"/>
-        </w:rPr>
-      </w:pPr>
-      <w:r>
-        <w:rPr>
-          <w:lang w:val="en-US"/>
-        </w:rPr>
-        <w:t xml:space="preserve">I did my </w:t>
-      </w:r>
-      <w:r>
-        <w:rPr>
-          <w:lang w:val="en-US"/>
-        </w:rPr>
-        <w:t xml:space="preserve">second </w:t>
-      </w:r>
-      <w:r>
-        <w:rPr>
-          <w:lang w:val="en-US"/>
-        </w:rPr>
-        <w:t>commit but somehow it did not go as</w:t>
-      </w:r>
-      <w:r>
-        <w:rPr>
-          <w:lang w:val="en-US"/>
-        </w:rPr>
-        <w:t xml:space="preserve"> I planned. I went to </w:t>
+        <w:t>Did first commit and worked on the navbar. Continued the 2-hour video.</w:t>
+      </w:r>
+    </w:p>
+    <w:p>
+      <w:pPr>
+        <w:pStyle w:val="Leipteksti"/>
+        <w:rPr>
+          <w:lang w:val="en-US"/>
+        </w:rPr>
+      </w:pPr>
+    </w:p>
+    <w:p>
+      <w:pPr>
+        <w:pStyle w:val="Leipteksti"/>
+        <w:rPr>
+          <w:lang w:val="en-US"/>
+        </w:rPr>
+      </w:pPr>
+      <w:r>
+        <w:rPr>
+          <w:lang w:val="en-US"/>
+        </w:rPr>
+        <w:t xml:space="preserve">27.2.2026 </w:t>
+      </w:r>
+    </w:p>
+    <w:p>
+      <w:pPr>
+        <w:pStyle w:val="Leipteksti"/>
+        <w:rPr>
+          <w:lang w:val="en-US"/>
+        </w:rPr>
+      </w:pPr>
+      <w:r>
+        <w:rPr>
+          <w:lang w:val="en-US"/>
+        </w:rPr>
+        <w:t xml:space="preserve">Continued the vid and made second commit, added elements and </w:t>
       </w:r>
       <w:proofErr w:type="spellStart"/>
       <w:r>
         <w:rPr>
           <w:lang w:val="en-US"/>
         </w:rPr>
-        <w:t>stackoverflow</w:t>
+        <w:t>css</w:t>
       </w:r>
       <w:proofErr w:type="spellEnd"/>
       <w:r>
         <w:rPr>
           <w:lang w:val="en-US"/>
         </w:rPr>
-        <w:t xml:space="preserve"> and found quite many threads about version control problems. I was able to figure out what was the problem and continued to watch the first part till the end.</w:t>
-      </w:r>
-    </w:p>
-    <w:p>
-      <w:pPr>
-        <w:pStyle w:val="BodyText"/>
-        <w:rPr>
-          <w:b/>
-          <w:lang w:val="en-US"/>
-        </w:rPr>
-      </w:pPr>
-      <w:r>
-        <w:rPr>
-          <w:lang w:val="en-US"/>
-        </w:rPr>
-        <w:br w:type="page"/>
-      </w:r>
-      <w:r>
-        <w:rPr>
-          <w:b/>
-          <w:lang w:val="en-US"/>
-        </w:rPr>
-        <w:lastRenderedPageBreak/>
-        <w:t>EXAMPLE STYLE 2</w:t>
-      </w:r>
-    </w:p>
-    <w:p>
-      <w:pPr>
-        <w:pStyle w:val="BodyText"/>
-        <w:rPr>
-          <w:b/>
-          <w:lang w:val="en-US"/>
-        </w:rPr>
-      </w:pPr>
-    </w:p>
-    <w:p>
-      <w:pPr>
-        <w:pStyle w:val="BodyText"/>
-        <w:rPr>
-          <w:lang w:val="en-US"/>
-        </w:rPr>
-      </w:pPr>
-      <w:r>
-        <w:rPr>
-          <w:lang w:val="en-US"/>
-        </w:rPr>
-        <w:t>10.9.2018</w:t>
-      </w:r>
-    </w:p>
-    <w:p>
-      <w:pPr>
-        <w:pStyle w:val="BodyText"/>
-        <w:rPr>
-          <w:lang w:val="en-US"/>
-        </w:rPr>
-      </w:pPr>
-    </w:p>
-    <w:p>
-      <w:pPr>
-        <w:pStyle w:val="BodyText"/>
-        <w:rPr>
-          <w:lang w:val="en-US"/>
-        </w:rPr>
-      </w:pPr>
-      <w:r>
-        <w:rPr>
-          <w:lang w:val="en-US"/>
-        </w:rPr>
-        <w:t>I learned about,</w:t>
-      </w:r>
-    </w:p>
-    <w:p>
-      <w:pPr>
-        <w:pStyle w:val="BodyText"/>
-        <w:rPr>
-          <w:lang w:val="en-US"/>
-        </w:rPr>
-      </w:pPr>
-    </w:p>
-    <w:p>
-      <w:pPr>
-        <w:pStyle w:val="BodyText"/>
-        <w:rPr>
-          <w:lang w:val="en-US"/>
-        </w:rPr>
-      </w:pPr>
-      <w:r>
-        <w:rPr>
-          <w:lang w:val="en-US"/>
-        </w:rPr>
-        <w:t>version control, but mostly it was just refreshing my memory. What I learned was…</w:t>
-      </w:r>
-    </w:p>
-    <w:p>
-      <w:pPr>
-        <w:pStyle w:val="BodyText"/>
-        <w:rPr>
-          <w:lang w:val="en-US"/>
-        </w:rPr>
-      </w:pPr>
-    </w:p>
-    <w:p>
-      <w:pPr>
-        <w:pStyle w:val="BodyText"/>
-        <w:rPr>
-          <w:lang w:val="en-US"/>
-        </w:rPr>
-      </w:pPr>
-      <w:r>
-        <w:rPr>
-          <w:lang w:val="en-US"/>
-        </w:rPr>
-        <w:t>how to develop as a becoming software professional. I find &lt;something&gt; interesting, because…</w:t>
-      </w:r>
-    </w:p>
-    <w:p>
-      <w:pPr>
-        <w:pStyle w:val="BodyText"/>
-        <w:rPr>
-          <w:lang w:val="en-US"/>
-        </w:rPr>
-      </w:pPr>
-    </w:p>
-    <w:p>
-      <w:pPr>
-        <w:pStyle w:val="BodyText"/>
-        <w:rPr>
-          <w:lang w:val="en-US"/>
-        </w:rPr>
-      </w:pPr>
-      <w:r>
-        <w:rPr>
-          <w:lang w:val="en-US"/>
-        </w:rPr>
-        <w:t>how to set up Atom environment with addons. There was one problem that took me a lot of time to solve. The problem was about …</w:t>
-      </w:r>
-    </w:p>
-    <w:p>
-      <w:pPr>
-        <w:pStyle w:val="BodyText"/>
-        <w:rPr>
-          <w:lang w:val="en-US"/>
-        </w:rPr>
-      </w:pPr>
-    </w:p>
-    <w:p>
-      <w:pPr>
-        <w:pStyle w:val="BodyText"/>
-        <w:rPr>
-          <w:lang w:val="en-US"/>
-        </w:rPr>
-      </w:pPr>
-      <w:r>
-        <w:rPr>
-          <w:lang w:val="en-US"/>
-        </w:rPr>
-        <w:t>Etc.</w:t>
-      </w:r>
-    </w:p>
-    <w:p>
-      <w:pPr>
-        <w:pStyle w:val="BodyText"/>
-        <w:rPr>
-          <w:lang w:val="en-US"/>
-        </w:rPr>
-      </w:pPr>
-    </w:p>
-    <w:p>
-      <w:pPr>
-        <w:pStyle w:val="BodyText"/>
-        <w:rPr>
-          <w:b/>
-          <w:lang w:val="en-US"/>
-        </w:rPr>
-      </w:pPr>
-      <w:r>
-        <w:rPr>
-          <w:b/>
-          <w:lang w:val="en-US"/>
-        </w:rPr>
-        <w:t>EXAMPLE STYLE 3</w:t>
-      </w:r>
-    </w:p>
-    <w:p>
-      <w:pPr>
-        <w:pStyle w:val="BodyText"/>
-        <w:rPr>
-          <w:b/>
-          <w:lang w:val="en-US"/>
-        </w:rPr>
-      </w:pPr>
-    </w:p>
-    <w:p>
-      <w:pPr>
-        <w:pStyle w:val="BodyText"/>
-        <w:rPr>
-          <w:lang w:val="en-US"/>
-        </w:rPr>
-      </w:pPr>
-      <w:r>
-        <w:rPr>
-          <w:lang w:val="en-US"/>
-        </w:rPr>
-        <w:t>Freeform.</w:t>
-      </w:r>
-    </w:p>
-    <w:p>
-      <w:pPr>
-        <w:pStyle w:val="BodyText"/>
-        <w:rPr>
-          <w:lang w:val="en-US"/>
-        </w:rPr>
-      </w:pPr>
-    </w:p>
-    <w:p>
-      <w:pPr>
-        <w:pStyle w:val="BodyText"/>
-        <w:rPr>
-          <w:lang w:val="en-US"/>
-        </w:rPr>
-      </w:pPr>
-      <w:r>
-        <w:rPr>
-          <w:lang w:val="en-US"/>
-        </w:rPr>
-        <w:t xml:space="preserve">Something else, but reasonable. </w:t>
-      </w:r>
-      <w:r>
-        <w:rPr>
-          <w:lang w:val="en-US"/>
-        </w:rPr>
-        <w:t>You must document what you have done, learned and when this have happened.</w:t>
-      </w:r>
-    </w:p>
+        <w:t>.</w:t>
+      </w:r>
+    </w:p>
+    <w:p>
+      <w:pPr>
+        <w:pStyle w:val="Leipteksti"/>
+        <w:rPr>
+          <w:lang w:val="en-US"/>
+        </w:rPr>
+      </w:pPr>
+    </w:p>
+    <w:p>
+      <w:pPr>
+        <w:pStyle w:val="Leipteksti"/>
+        <w:rPr>
+          <w:lang w:val="en-US"/>
+        </w:rPr>
+      </w:pPr>
+      <w:r>
+        <w:rPr>
+          <w:lang w:val="en-US"/>
+        </w:rPr>
+        <w:t>2.3.2026</w:t>
+      </w:r>
+    </w:p>
+    <w:p>
+      <w:pPr>
+        <w:pStyle w:val="Leipteksti"/>
+        <w:rPr>
+          <w:lang w:val="en-US"/>
+        </w:rPr>
+      </w:pPr>
+      <w:r>
+        <w:rPr>
+          <w:lang w:val="en-US"/>
+        </w:rPr>
+        <w:t xml:space="preserve">Continued the video and </w:t>
+      </w:r>
+      <w:proofErr w:type="spellStart"/>
+      <w:r>
+        <w:rPr>
+          <w:lang w:val="en-US"/>
+        </w:rPr>
+        <w:t>tasklist</w:t>
+      </w:r>
+      <w:proofErr w:type="spellEnd"/>
+      <w:r>
+        <w:rPr>
+          <w:lang w:val="en-US"/>
+        </w:rPr>
+        <w:t xml:space="preserve"> and made third commit. Made more elements and expanded </w:t>
+      </w:r>
+      <w:proofErr w:type="spellStart"/>
+      <w:r>
+        <w:rPr>
+          <w:lang w:val="en-US"/>
+        </w:rPr>
+        <w:t>css</w:t>
+      </w:r>
+      <w:proofErr w:type="spellEnd"/>
+      <w:r>
+        <w:rPr>
+          <w:lang w:val="en-US"/>
+        </w:rPr>
+        <w:t xml:space="preserve"> a lot.</w:t>
+      </w:r>
+    </w:p>
+    <w:p>
+      <w:pPr>
+        <w:pStyle w:val="Leipteksti"/>
+        <w:rPr>
+          <w:lang w:val="en-US"/>
+        </w:rPr>
+      </w:pPr>
+    </w:p>
+    <w:p>
+      <w:pPr>
+        <w:pStyle w:val="Leipteksti"/>
+        <w:rPr>
+          <w:lang w:val="en-US"/>
+        </w:rPr>
+      </w:pPr>
+      <w:r>
+        <w:rPr>
+          <w:lang w:val="en-US"/>
+        </w:rPr>
+        <w:t>18.5.2026</w:t>
+      </w:r>
+    </w:p>
+    <w:p>
+      <w:pPr>
+        <w:pStyle w:val="Leipteksti"/>
+        <w:rPr>
+          <w:lang w:val="en-US"/>
+        </w:rPr>
+      </w:pPr>
+      <w:r>
+        <w:rPr>
+          <w:lang w:val="en-US"/>
+        </w:rPr>
+        <w:t xml:space="preserve">Been a while, something came up in my personal life. Continued the video and </w:t>
+      </w:r>
+    </w:p>
+    <w:p>
+      <w:pPr>
+        <w:pStyle w:val="Leipteksti"/>
+        <w:rPr>
+          <w:lang w:val="en-US"/>
+        </w:rPr>
+      </w:pPr>
+    </w:p>
+    <w:p/>
     <w:sectPr>
       <w:headerReference w:type="default" r:id="rId10"/>
       <w:footerReference w:type="default" r:id="rId11"/>
@@ -1018,7 +881,7 @@
 </file>
 
 <file path=word/endnotes.xml><?xml version="1.0" encoding="utf-8"?>
-<w:endnotes xmlns:wpc="http://schemas.microsoft.com/office/word/2010/wordprocessingCanvas" xmlns:cx="http://schemas.microsoft.com/office/drawing/2014/chartex" xmlns:cx1="http://schemas.microsoft.com/office/drawing/2015/9/8/chartex" xmlns:cx2="http://schemas.microsoft.com/office/drawing/2015/10/21/chartex" xmlns:cx3="http://schemas.microsoft.com/office/drawing/2016/5/9/chartex" xmlns:cx4="http://schemas.microsoft.com/office/drawing/2016/5/10/chartex" xmlns:cx5="http://schemas.microsoft.com/office/drawing/2016/5/11/chartex" xmlns:cx6="http://schemas.microsoft.com/office/drawing/2016/5/12/chartex" xmlns:cx7="http://schemas.microsoft.com/office/drawing/2016/5/13/chartex" xmlns:cx8="http://schemas.microsoft.com/office/drawing/2016/5/14/chartex" xmlns:mc="http://schemas.openxmlformats.org/markup-compatibility/2006" xmlns:aink="http://schemas.microsoft.com/office/drawing/2016/ink" xmlns:am3d="http://schemas.microsoft.com/office/drawing/2017/model3d" xmlns:o="urn:schemas-microsoft-com:office:office" xmlns:oel="http://schemas.microsoft.com/office/2019/extlst" xmlns:r="http://schemas.openxmlformats.org/officeDocument/2006/relationships" xmlns:m="http://schemas.openxmlformats.org/officeDocument/2006/math" xmlns:v="urn:schemas-microsoft-com:vml" xmlns:wp14="http://schemas.microsoft.com/office/word/2010/wordprocessingDrawing" xmlns:wp="http://schemas.openxmlformats.org/drawingml/2006/wordprocessingDrawing" xmlns:w10="urn:schemas-microsoft-com:office:word" xmlns:w="http://schemas.openxmlformats.org/wordprocessingml/2006/main" xmlns:w14="http://schemas.microsoft.com/office/word/2010/wordml" xmlns:w15="http://schemas.microsoft.com/office/word/2012/wordml" xmlns:w16cex="http://schemas.microsoft.com/office/word/2018/wordml/cex" xmlns:w16cid="http://schemas.microsoft.com/office/word/2016/wordml/cid" xmlns:w16="http://schemas.microsoft.com/office/word/2018/wordml" xmlns:w16sdtdh="http://schemas.microsoft.com/office/word/2020/wordml/sdtdatahash" xmlns:w16se="http://schemas.microsoft.com/office/word/2015/wordml/symex" xmlns:wpg="http://schemas.microsoft.com/office/word/2010/wordprocessingGroup" xmlns:wpi="http://schemas.microsoft.com/office/word/2010/wordprocessingInk" xmlns:wne="http://schemas.microsoft.com/office/word/2006/wordml" xmlns:wps="http://schemas.microsoft.com/office/word/2010/wordprocessingShape" mc:Ignorable="w14 w15 w16se w16cid w16 w16cex w16sdtdh wp14">
+<w:endnotes xmlns:wpc="http://schemas.microsoft.com/office/word/2010/wordprocessingCanvas" xmlns:cx="http://schemas.microsoft.com/office/drawing/2014/chartex" xmlns:cx1="http://schemas.microsoft.com/office/drawing/2015/9/8/chartex" xmlns:cx2="http://schemas.microsoft.com/office/drawing/2015/10/21/chartex" xmlns:cx3="http://schemas.microsoft.com/office/drawing/2016/5/9/chartex" xmlns:cx4="http://schemas.microsoft.com/office/drawing/2016/5/10/chartex" xmlns:cx5="http://schemas.microsoft.com/office/drawing/2016/5/11/chartex" xmlns:cx6="http://schemas.microsoft.com/office/drawing/2016/5/12/chartex" xmlns:cx7="http://schemas.microsoft.com/office/drawing/2016/5/13/chartex" xmlns:cx8="http://schemas.microsoft.com/office/drawing/2016/5/14/chartex" xmlns:mc="http://schemas.openxmlformats.org/markup-compatibility/2006" xmlns:aink="http://schemas.microsoft.com/office/drawing/2016/ink" xmlns:am3d="http://schemas.microsoft.com/office/drawing/2017/model3d" xmlns:o="urn:schemas-microsoft-com:office:office" xmlns:oel="http://schemas.microsoft.com/office/2019/extlst" xmlns:r="http://schemas.openxmlformats.org/officeDocument/2006/relationships" xmlns:m="http://schemas.openxmlformats.org/officeDocument/2006/math" xmlns:v="urn:schemas-microsoft-com:vml" xmlns:wp14="http://schemas.microsoft.com/office/word/2010/wordprocessingDrawing" xmlns:wp="http://schemas.openxmlformats.org/drawingml/2006/wordprocessingDrawing" xmlns:w10="urn:schemas-microsoft-com:office:word" xmlns:w="http://schemas.openxmlformats.org/wordprocessingml/2006/main" xmlns:w14="http://schemas.microsoft.com/office/word/2010/wordml" xmlns:w15="http://schemas.microsoft.com/office/word/2012/wordml" xmlns:w16cex="http://schemas.microsoft.com/office/word/2018/wordml/cex" xmlns:w16cid="http://schemas.microsoft.com/office/word/2016/wordml/cid" xmlns:w16="http://schemas.microsoft.com/office/word/2018/wordml" xmlns:w16du="http://schemas.microsoft.com/office/word/2023/wordml/word16du" xmlns:w16sdtdh="http://schemas.microsoft.com/office/word/2020/wordml/sdtdatahash" xmlns:w16sdtfl="http://schemas.microsoft.com/office/word/2024/wordml/sdtformatlock" xmlns:w16se="http://schemas.microsoft.com/office/word/2015/wordml/symex" xmlns:wpg="http://schemas.microsoft.com/office/word/2010/wordprocessingGroup" xmlns:wpi="http://schemas.microsoft.com/office/word/2010/wordprocessingInk" xmlns:wne="http://schemas.microsoft.com/office/word/2006/wordml" xmlns:wps="http://schemas.microsoft.com/office/word/2010/wordprocessingShape" mc:Ignorable="w14 w15 w16se w16cid w16 w16cex w16sdtdh w16sdtfl w16du wp14">
   <w:endnote w:type="separator" w:id="-1">
     <w:p>
       <w:r>
@@ -1037,10 +900,10 @@
 </file>
 
 <file path=word/footer1.xml><?xml version="1.0" encoding="utf-8"?>
-<w:ftr xmlns:wpc="http://schemas.microsoft.com/office/word/2010/wordprocessingCanvas" xmlns:cx="http://schemas.microsoft.com/office/drawing/2014/chartex" xmlns:cx1="http://schemas.microsoft.com/office/drawing/2015/9/8/chartex" xmlns:cx2="http://schemas.microsoft.com/office/drawing/2015/10/21/chartex" xmlns:cx3="http://schemas.microsoft.com/office/drawing/2016/5/9/chartex" xmlns:cx4="http://schemas.microsoft.com/office/drawing/2016/5/10/chartex" xmlns:cx5="http://schemas.microsoft.com/office/drawing/2016/5/11/chartex" xmlns:cx6="http://schemas.microsoft.com/office/drawing/2016/5/12/chartex" xmlns:cx7="http://schemas.microsoft.com/office/drawing/2016/5/13/chartex" xmlns:cx8="http://schemas.microsoft.com/office/drawing/2016/5/14/chartex" xmlns:mc="http://schemas.openxmlformats.org/markup-compatibility/2006" xmlns:aink="http://schemas.microsoft.com/office/drawing/2016/ink" xmlns:am3d="http://schemas.microsoft.com/office/drawing/2017/model3d" xmlns:o="urn:schemas-microsoft-com:office:office" xmlns:oel="http://schemas.microsoft.com/office/2019/extlst" xmlns:r="http://schemas.openxmlformats.org/officeDocument/2006/relationships" xmlns:m="http://schemas.openxmlformats.org/officeDocument/2006/math" xmlns:v="urn:schemas-microsoft-com:vml" xmlns:wp14="http://schemas.microsoft.com/office/word/2010/wordprocessingDrawing" xmlns:wp="http://schemas.openxmlformats.org/drawingml/2006/wordprocessingDrawing" xmlns:w10="urn:schemas-microsoft-com:office:word" xmlns:w="http://schemas.openxmlformats.org/wordprocessingml/2006/main" xmlns:w14="http://schemas.microsoft.com/office/word/2010/wordml" xmlns:w15="http://schemas.microsoft.com/office/word/2012/wordml" xmlns:w16cex="http://schemas.microsoft.com/office/word/2018/wordml/cex" xmlns:w16cid="http://schemas.microsoft.com/office/word/2016/wordml/cid" xmlns:w16="http://schemas.microsoft.com/office/word/2018/wordml" xmlns:w16sdtdh="http://schemas.microsoft.com/office/word/2020/wordml/sdtdatahash" xmlns:w16se="http://schemas.microsoft.com/office/word/2015/wordml/symex" xmlns:wpg="http://schemas.microsoft.com/office/word/2010/wordprocessingGroup" xmlns:wpi="http://schemas.microsoft.com/office/word/2010/wordprocessingInk" xmlns:wne="http://schemas.microsoft.com/office/word/2006/wordml" xmlns:wps="http://schemas.microsoft.com/office/word/2010/wordprocessingShape" mc:Ignorable="w14 w15 w16se w16cid w16 w16cex w16sdtdh wp14">
+<w:ftr xmlns:wpc="http://schemas.microsoft.com/office/word/2010/wordprocessingCanvas" xmlns:cx="http://schemas.microsoft.com/office/drawing/2014/chartex" xmlns:cx1="http://schemas.microsoft.com/office/drawing/2015/9/8/chartex" xmlns:cx2="http://schemas.microsoft.com/office/drawing/2015/10/21/chartex" xmlns:cx3="http://schemas.microsoft.com/office/drawing/2016/5/9/chartex" xmlns:cx4="http://schemas.microsoft.com/office/drawing/2016/5/10/chartex" xmlns:cx5="http://schemas.microsoft.com/office/drawing/2016/5/11/chartex" xmlns:cx6="http://schemas.microsoft.com/office/drawing/2016/5/12/chartex" xmlns:cx7="http://schemas.microsoft.com/office/drawing/2016/5/13/chartex" xmlns:cx8="http://schemas.microsoft.com/office/drawing/2016/5/14/chartex" xmlns:mc="http://schemas.openxmlformats.org/markup-compatibility/2006" xmlns:aink="http://schemas.microsoft.com/office/drawing/2016/ink" xmlns:am3d="http://schemas.microsoft.com/office/drawing/2017/model3d" xmlns:o="urn:schemas-microsoft-com:office:office" xmlns:oel="http://schemas.microsoft.com/office/2019/extlst" xmlns:r="http://schemas.openxmlformats.org/officeDocument/2006/relationships" xmlns:m="http://schemas.openxmlformats.org/officeDocument/2006/math" xmlns:v="urn:schemas-microsoft-com:vml" xmlns:wp14="http://schemas.microsoft.com/office/word/2010/wordprocessingDrawing" xmlns:wp="http://schemas.openxmlformats.org/drawingml/2006/wordprocessingDrawing" xmlns:w10="urn:schemas-microsoft-com:office:word" xmlns:w="http://schemas.openxmlformats.org/wordprocessingml/2006/main" xmlns:w14="http://schemas.microsoft.com/office/word/2010/wordml" xmlns:w15="http://schemas.microsoft.com/office/word/2012/wordml" xmlns:w16cex="http://schemas.microsoft.com/office/word/2018/wordml/cex" xmlns:w16cid="http://schemas.microsoft.com/office/word/2016/wordml/cid" xmlns:w16="http://schemas.microsoft.com/office/word/2018/wordml" xmlns:w16du="http://schemas.microsoft.com/office/word/2023/wordml/word16du" xmlns:w16sdtdh="http://schemas.microsoft.com/office/word/2020/wordml/sdtdatahash" xmlns:w16sdtfl="http://schemas.microsoft.com/office/word/2024/wordml/sdtformatlock" xmlns:w16se="http://schemas.microsoft.com/office/word/2015/wordml/symex" xmlns:wpg="http://schemas.microsoft.com/office/word/2010/wordprocessingGroup" xmlns:wpi="http://schemas.microsoft.com/office/word/2010/wordprocessingInk" xmlns:wne="http://schemas.microsoft.com/office/word/2006/wordml" xmlns:wps="http://schemas.microsoft.com/office/word/2010/wordprocessingShape" mc:Ignorable="w14 w15 w16se w16cid w16 w16cex w16sdtdh w16sdtfl w16du wp14">
   <w:p>
     <w:pPr>
-      <w:pStyle w:val="Footer"/>
+      <w:pStyle w:val="Alatunniste"/>
       <w:jc w:val="center"/>
       <w:rPr>
         <w:sz w:val="20"/>
@@ -1050,19 +913,19 @@
   </w:p>
   <w:p>
     <w:pPr>
-      <w:pStyle w:val="Footer"/>
+      <w:pStyle w:val="Alatunniste"/>
     </w:pPr>
   </w:p>
   <w:p>
     <w:pPr>
-      <w:pStyle w:val="Footer"/>
+      <w:pStyle w:val="Alatunniste"/>
     </w:pPr>
   </w:p>
 </w:ftr>
 </file>
 
 <file path=word/footnotes.xml><?xml version="1.0" encoding="utf-8"?>
-<w:footnotes xmlns:wpc="http://schemas.microsoft.com/office/word/2010/wordprocessingCanvas" xmlns:cx="http://schemas.microsoft.com/office/drawing/2014/chartex" xmlns:cx1="http://schemas.microsoft.com/office/drawing/2015/9/8/chartex" xmlns:cx2="http://schemas.microsoft.com/office/drawing/2015/10/21/chartex" xmlns:cx3="http://schemas.microsoft.com/office/drawing/2016/5/9/chartex" xmlns:cx4="http://schemas.microsoft.com/office/drawing/2016/5/10/chartex" xmlns:cx5="http://schemas.microsoft.com/office/drawing/2016/5/11/chartex" xmlns:cx6="http://schemas.microsoft.com/office/drawing/2016/5/12/chartex" xmlns:cx7="http://schemas.microsoft.com/office/drawing/2016/5/13/chartex" xmlns:cx8="http://schemas.microsoft.com/office/drawing/2016/5/14/chartex" xmlns:mc="http://schemas.openxmlformats.org/markup-compatibility/2006" xmlns:aink="http://schemas.microsoft.com/office/drawing/2016/ink" xmlns:am3d="http://schemas.microsoft.com/office/drawing/2017/model3d" xmlns:o="urn:schemas-microsoft-com:office:office" xmlns:oel="http://schemas.microsoft.com/office/2019/extlst" xmlns:r="http://schemas.openxmlformats.org/officeDocument/2006/relationships" xmlns:m="http://schemas.openxmlformats.org/officeDocument/2006/math" xmlns:v="urn:schemas-microsoft-com:vml" xmlns:wp14="http://schemas.microsoft.com/office/word/2010/wordprocessingDrawing" xmlns:wp="http://schemas.openxmlformats.org/drawingml/2006/wordprocessingDrawing" xmlns:w10="urn:schemas-microsoft-com:office:word" xmlns:w="http://schemas.openxmlformats.org/wordprocessingml/2006/main" xmlns:w14="http://schemas.microsoft.com/office/word/2010/wordml" xmlns:w15="http://schemas.microsoft.com/office/word/2012/wordml" xmlns:w16cex="http://schemas.microsoft.com/office/word/2018/wordml/cex" xmlns:w16cid="http://schemas.microsoft.com/office/word/2016/wordml/cid" xmlns:w16="http://schemas.microsoft.com/office/word/2018/wordml" xmlns:w16sdtdh="http://schemas.microsoft.com/office/word/2020/wordml/sdtdatahash" xmlns:w16se="http://schemas.microsoft.com/office/word/2015/wordml/symex" xmlns:wpg="http://schemas.microsoft.com/office/word/2010/wordprocessingGroup" xmlns:wpi="http://schemas.microsoft.com/office/word/2010/wordprocessingInk" xmlns:wne="http://schemas.microsoft.com/office/word/2006/wordml" xmlns:wps="http://schemas.microsoft.com/office/word/2010/wordprocessingShape" mc:Ignorable="w14 w15 w16se w16cid w16 w16cex w16sdtdh wp14">
+<w:footnotes xmlns:wpc="http://schemas.microsoft.com/office/word/2010/wordprocessingCanvas" xmlns:cx="http://schemas.microsoft.com/office/drawing/2014/chartex" xmlns:cx1="http://schemas.microsoft.com/office/drawing/2015/9/8/chartex" xmlns:cx2="http://schemas.microsoft.com/office/drawing/2015/10/21/chartex" xmlns:cx3="http://schemas.microsoft.com/office/drawing/2016/5/9/chartex" xmlns:cx4="http://schemas.microsoft.com/office/drawing/2016/5/10/chartex" xmlns:cx5="http://schemas.microsoft.com/office/drawing/2016/5/11/chartex" xmlns:cx6="http://schemas.microsoft.com/office/drawing/2016/5/12/chartex" xmlns:cx7="http://schemas.microsoft.com/office/drawing/2016/5/13/chartex" xmlns:cx8="http://schemas.microsoft.com/office/drawing/2016/5/14/chartex" xmlns:mc="http://schemas.openxmlformats.org/markup-compatibility/2006" xmlns:aink="http://schemas.microsoft.com/office/drawing/2016/ink" xmlns:am3d="http://schemas.microsoft.com/office/drawing/2017/model3d" xmlns:o="urn:schemas-microsoft-com:office:office" xmlns:oel="http://schemas.microsoft.com/office/2019/extlst" xmlns:r="http://schemas.openxmlformats.org/officeDocument/2006/relationships" xmlns:m="http://schemas.openxmlformats.org/officeDocument/2006/math" xmlns:v="urn:schemas-microsoft-com:vml" xmlns:wp14="http://schemas.microsoft.com/office/word/2010/wordprocessingDrawing" xmlns:wp="http://schemas.openxmlformats.org/drawingml/2006/wordprocessingDrawing" xmlns:w10="urn:schemas-microsoft-com:office:word" xmlns:w="http://schemas.openxmlformats.org/wordprocessingml/2006/main" xmlns:w14="http://schemas.microsoft.com/office/word/2010/wordml" xmlns:w15="http://schemas.microsoft.com/office/word/2012/wordml" xmlns:w16cex="http://schemas.microsoft.com/office/word/2018/wordml/cex" xmlns:w16cid="http://schemas.microsoft.com/office/word/2016/wordml/cid" xmlns:w16="http://schemas.microsoft.com/office/word/2018/wordml" xmlns:w16du="http://schemas.microsoft.com/office/word/2023/wordml/word16du" xmlns:w16sdtdh="http://schemas.microsoft.com/office/word/2020/wordml/sdtdatahash" xmlns:w16sdtfl="http://schemas.microsoft.com/office/word/2024/wordml/sdtformatlock" xmlns:w16se="http://schemas.microsoft.com/office/word/2015/wordml/symex" xmlns:wpg="http://schemas.microsoft.com/office/word/2010/wordprocessingGroup" xmlns:wpi="http://schemas.microsoft.com/office/word/2010/wordprocessingInk" xmlns:wne="http://schemas.microsoft.com/office/word/2006/wordml" xmlns:wps="http://schemas.microsoft.com/office/word/2010/wordprocessingShape" mc:Ignorable="w14 w15 w16se w16cid w16 w16cex w16sdtdh w16sdtfl w16du wp14">
   <w:footnote w:type="separator" w:id="-1">
     <w:p>
       <w:r>
@@ -1081,10 +944,10 @@
 </file>
 
 <file path=word/header1.xml><?xml version="1.0" encoding="utf-8"?>
-<w:hdr xmlns:wpc="http://schemas.microsoft.com/office/word/2010/wordprocessingCanvas" xmlns:cx="http://schemas.microsoft.com/office/drawing/2014/chartex" xmlns:cx1="http://schemas.microsoft.com/office/drawing/2015/9/8/chartex" xmlns:cx2="http://schemas.microsoft.com/office/drawing/2015/10/21/chartex" xmlns:cx3="http://schemas.microsoft.com/office/drawing/2016/5/9/chartex" xmlns:cx4="http://schemas.microsoft.com/office/drawing/2016/5/10/chartex" xmlns:cx5="http://schemas.microsoft.com/office/drawing/2016/5/11/chartex" xmlns:cx6="http://schemas.microsoft.com/office/drawing/2016/5/12/chartex" xmlns:cx7="http://schemas.microsoft.com/office/drawing/2016/5/13/chartex" xmlns:cx8="http://schemas.microsoft.com/office/drawing/2016/5/14/chartex" xmlns:mc="http://schemas.openxmlformats.org/markup-compatibility/2006" xmlns:aink="http://schemas.microsoft.com/office/drawing/2016/ink" xmlns:am3d="http://schemas.microsoft.com/office/drawing/2017/model3d" xmlns:o="urn:schemas-microsoft-com:office:office" xmlns:oel="http://schemas.microsoft.com/office/2019/extlst" xmlns:r="http://schemas.openxmlformats.org/officeDocument/2006/relationships" xmlns:m="http://schemas.openxmlformats.org/officeDocument/2006/math" xmlns:v="urn:schemas-microsoft-com:vml" xmlns:wp14="http://schemas.microsoft.com/office/word/2010/wordprocessingDrawing" xmlns:wp="http://schemas.openxmlformats.org/drawingml/2006/wordprocessingDrawing" xmlns:w10="urn:schemas-microsoft-com:office:word" xmlns:w="http://schemas.openxmlformats.org/wordprocessingml/2006/main" xmlns:w14="http://schemas.microsoft.com/office/word/2010/wordml" xmlns:w15="http://schemas.microsoft.com/office/word/2012/wordml" xmlns:w16cex="http://schemas.microsoft.com/office/word/2018/wordml/cex" xmlns:w16cid="http://schemas.microsoft.com/office/word/2016/wordml/cid" xmlns:w16="http://schemas.microsoft.com/office/word/2018/wordml" xmlns:w16sdtdh="http://schemas.microsoft.com/office/word/2020/wordml/sdtdatahash" xmlns:w16se="http://schemas.microsoft.com/office/word/2015/wordml/symex" xmlns:wpg="http://schemas.microsoft.com/office/word/2010/wordprocessingGroup" xmlns:wpi="http://schemas.microsoft.com/office/word/2010/wordprocessingInk" xmlns:wne="http://schemas.microsoft.com/office/word/2006/wordml" xmlns:wps="http://schemas.microsoft.com/office/word/2010/wordprocessingShape" mc:Ignorable="w14 w15 w16se w16cid w16 w16cex w16sdtdh wp14">
+<w:hdr xmlns:wpc="http://schemas.microsoft.com/office/word/2010/wordprocessingCanvas" xmlns:cx="http://schemas.microsoft.com/office/drawing/2014/chartex" xmlns:cx1="http://schemas.microsoft.com/office/drawing/2015/9/8/chartex" xmlns:cx2="http://schemas.microsoft.com/office/drawing/2015/10/21/chartex" xmlns:cx3="http://schemas.microsoft.com/office/drawing/2016/5/9/chartex" xmlns:cx4="http://schemas.microsoft.com/office/drawing/2016/5/10/chartex" xmlns:cx5="http://schemas.microsoft.com/office/drawing/2016/5/11/chartex" xmlns:cx6="http://schemas.microsoft.com/office/drawing/2016/5/12/chartex" xmlns:cx7="http://schemas.microsoft.com/office/drawing/2016/5/13/chartex" xmlns:cx8="http://schemas.microsoft.com/office/drawing/2016/5/14/chartex" xmlns:mc="http://schemas.openxmlformats.org/markup-compatibility/2006" xmlns:aink="http://schemas.microsoft.com/office/drawing/2016/ink" xmlns:am3d="http://schemas.microsoft.com/office/drawing/2017/model3d" xmlns:o="urn:schemas-microsoft-com:office:office" xmlns:oel="http://schemas.microsoft.com/office/2019/extlst" xmlns:r="http://schemas.openxmlformats.org/officeDocument/2006/relationships" xmlns:m="http://schemas.openxmlformats.org/officeDocument/2006/math" xmlns:v="urn:schemas-microsoft-com:vml" xmlns:wp14="http://schemas.microsoft.com/office/word/2010/wordprocessingDrawing" xmlns:wp="http://schemas.openxmlformats.org/drawingml/2006/wordprocessingDrawing" xmlns:w10="urn:schemas-microsoft-com:office:word" xmlns:w="http://schemas.openxmlformats.org/wordprocessingml/2006/main" xmlns:w14="http://schemas.microsoft.com/office/word/2010/wordml" xmlns:w15="http://schemas.microsoft.com/office/word/2012/wordml" xmlns:w16cex="http://schemas.microsoft.com/office/word/2018/wordml/cex" xmlns:w16cid="http://schemas.microsoft.com/office/word/2016/wordml/cid" xmlns:w16="http://schemas.microsoft.com/office/word/2018/wordml" xmlns:w16du="http://schemas.microsoft.com/office/word/2023/wordml/word16du" xmlns:w16sdtdh="http://schemas.microsoft.com/office/word/2020/wordml/sdtdatahash" xmlns:w16sdtfl="http://schemas.microsoft.com/office/word/2024/wordml/sdtformatlock" xmlns:w16se="http://schemas.microsoft.com/office/word/2015/wordml/symex" xmlns:wpg="http://schemas.microsoft.com/office/word/2010/wordprocessingGroup" xmlns:wpi="http://schemas.microsoft.com/office/word/2010/wordprocessingInk" xmlns:wne="http://schemas.microsoft.com/office/word/2006/wordml" xmlns:wps="http://schemas.microsoft.com/office/word/2010/wordprocessingShape" mc:Ignorable="w14 w15 w16se w16cid w16 w16cex w16sdtdh w16sdtfl w16du wp14">
   <w:p>
     <w:pPr>
-      <w:pStyle w:val="Header"/>
+      <w:pStyle w:val="Yltunniste"/>
       <w:jc w:val="center"/>
     </w:pPr>
   </w:p>
@@ -1092,7 +955,7 @@
 </file>
 
 <file path=word/numbering.xml><?xml version="1.0" encoding="utf-8"?>
-<w:numbering xmlns:wpc="http://schemas.microsoft.com/office/word/2010/wordprocessingCanvas" xmlns:cx="http://schemas.microsoft.com/office/drawing/2014/chartex" xmlns:cx1="http://schemas.microsoft.com/office/drawing/2015/9/8/chartex" xmlns:cx2="http://schemas.microsoft.com/office/drawing/2015/10/21/chartex" xmlns:cx3="http://schemas.microsoft.com/office/drawing/2016/5/9/chartex" xmlns:cx4="http://schemas.microsoft.com/office/drawing/2016/5/10/chartex" xmlns:cx5="http://schemas.microsoft.com/office/drawing/2016/5/11/chartex" xmlns:cx6="http://schemas.microsoft.com/office/drawing/2016/5/12/chartex" xmlns:cx7="http://schemas.microsoft.com/office/drawing/2016/5/13/chartex" xmlns:cx8="http://schemas.microsoft.com/office/drawing/2016/5/14/chartex" xmlns:mc="http://schemas.openxmlformats.org/markup-compatibility/2006" xmlns:aink="http://schemas.microsoft.com/office/drawing/2016/ink" xmlns:am3d="http://schemas.microsoft.com/office/drawing/2017/model3d" xmlns:o="urn:schemas-microsoft-com:office:office" xmlns:oel="http://schemas.microsoft.com/office/2019/extlst" xmlns:r="http://schemas.openxmlformats.org/officeDocument/2006/relationships" xmlns:m="http://schemas.openxmlformats.org/officeDocument/2006/math" xmlns:v="urn:schemas-microsoft-com:vml" xmlns:wp14="http://schemas.microsoft.com/office/word/2010/wordprocessingDrawing" xmlns:wp="http://schemas.openxmlformats.org/drawingml/2006/wordprocessingDrawing" xmlns:w10="urn:schemas-microsoft-com:office:word" xmlns:w="http://schemas.openxmlformats.org/wordprocessingml/2006/main" xmlns:w14="http://schemas.microsoft.com/office/word/2010/wordml" xmlns:w15="http://schemas.microsoft.com/office/word/2012/wordml" xmlns:w16cex="http://schemas.microsoft.com/office/word/2018/wordml/cex" xmlns:w16cid="http://schemas.microsoft.com/office/word/2016/wordml/cid" xmlns:w16="http://schemas.microsoft.com/office/word/2018/wordml" xmlns:w16sdtdh="http://schemas.microsoft.com/office/word/2020/wordml/sdtdatahash" xmlns:w16se="http://schemas.microsoft.com/office/word/2015/wordml/symex" xmlns:wpg="http://schemas.microsoft.com/office/word/2010/wordprocessingGroup" xmlns:wpi="http://schemas.microsoft.com/office/word/2010/wordprocessingInk" xmlns:wne="http://schemas.microsoft.com/office/word/2006/wordml" xmlns:wps="http://schemas.microsoft.com/office/word/2010/wordprocessingShape" mc:Ignorable="w14 w15 w16se w16cid w16 w16cex w16sdtdh wp14">
+<w:numbering xmlns:wpc="http://schemas.microsoft.com/office/word/2010/wordprocessingCanvas" xmlns:cx="http://schemas.microsoft.com/office/drawing/2014/chartex" xmlns:cx1="http://schemas.microsoft.com/office/drawing/2015/9/8/chartex" xmlns:cx2="http://schemas.microsoft.com/office/drawing/2015/10/21/chartex" xmlns:cx3="http://schemas.microsoft.com/office/drawing/2016/5/9/chartex" xmlns:cx4="http://schemas.microsoft.com/office/drawing/2016/5/10/chartex" xmlns:cx5="http://schemas.microsoft.com/office/drawing/2016/5/11/chartex" xmlns:cx6="http://schemas.microsoft.com/office/drawing/2016/5/12/chartex" xmlns:cx7="http://schemas.microsoft.com/office/drawing/2016/5/13/chartex" xmlns:cx8="http://schemas.microsoft.com/office/drawing/2016/5/14/chartex" xmlns:mc="http://schemas.openxmlformats.org/markup-compatibility/2006" xmlns:aink="http://schemas.microsoft.com/office/drawing/2016/ink" xmlns:am3d="http://schemas.microsoft.com/office/drawing/2017/model3d" xmlns:o="urn:schemas-microsoft-com:office:office" xmlns:oel="http://schemas.microsoft.com/office/2019/extlst" xmlns:r="http://schemas.openxmlformats.org/officeDocument/2006/relationships" xmlns:m="http://schemas.openxmlformats.org/officeDocument/2006/math" xmlns:v="urn:schemas-microsoft-com:vml" xmlns:wp14="http://schemas.microsoft.com/office/word/2010/wordprocessingDrawing" xmlns:wp="http://schemas.openxmlformats.org/drawingml/2006/wordprocessingDrawing" xmlns:w10="urn:schemas-microsoft-com:office:word" xmlns:w="http://schemas.openxmlformats.org/wordprocessingml/2006/main" xmlns:w14="http://schemas.microsoft.com/office/word/2010/wordml" xmlns:w15="http://schemas.microsoft.com/office/word/2012/wordml" xmlns:w16cex="http://schemas.microsoft.com/office/word/2018/wordml/cex" xmlns:w16cid="http://schemas.microsoft.com/office/word/2016/wordml/cid" xmlns:w16="http://schemas.microsoft.com/office/word/2018/wordml" xmlns:w16du="http://schemas.microsoft.com/office/word/2023/wordml/word16du" xmlns:w16sdtdh="http://schemas.microsoft.com/office/word/2020/wordml/sdtdatahash" xmlns:w16sdtfl="http://schemas.microsoft.com/office/word/2024/wordml/sdtformatlock" xmlns:w16se="http://schemas.microsoft.com/office/word/2015/wordml/symex" xmlns:wpg="http://schemas.microsoft.com/office/word/2010/wordprocessingGroup" xmlns:wpi="http://schemas.microsoft.com/office/word/2010/wordprocessingInk" xmlns:wne="http://schemas.microsoft.com/office/word/2006/wordml" xmlns:wps="http://schemas.microsoft.com/office/word/2010/wordprocessingShape" mc:Ignorable="w14 w15 w16se w16cid w16 w16cex w16sdtdh w16sdtfl w16du wp14">
   <w:abstractNum w:abstractNumId="0" w15:restartNumberingAfterBreak="0">
     <w:nsid w:val="3B530E8E"/>
     <w:multiLevelType w:val="hybridMultilevel"/>
@@ -1909,7 +1772,7 @@
     <w:lvl w:ilvl="0">
       <w:start w:val="1"/>
       <w:numFmt w:val="decimal"/>
-      <w:pStyle w:val="Heading1"/>
+      <w:pStyle w:val="Otsikko1"/>
       <w:lvlText w:val="%1"/>
       <w:lvlJc w:val="left"/>
       <w:pPr>
@@ -1922,7 +1785,7 @@
     <w:lvl w:ilvl="1">
       <w:start w:val="1"/>
       <w:numFmt w:val="decimal"/>
-      <w:pStyle w:val="Heading2"/>
+      <w:pStyle w:val="Otsikko2"/>
       <w:lvlText w:val="%1.%2"/>
       <w:lvlJc w:val="left"/>
       <w:pPr>
@@ -1935,7 +1798,7 @@
     <w:lvl w:ilvl="2">
       <w:start w:val="1"/>
       <w:numFmt w:val="decimal"/>
-      <w:pStyle w:val="Heading3"/>
+      <w:pStyle w:val="Otsikko3"/>
       <w:lvlText w:val="%1.%2.%3"/>
       <w:lvlJc w:val="left"/>
       <w:pPr>
@@ -1948,7 +1811,7 @@
     <w:lvl w:ilvl="3">
       <w:start w:val="1"/>
       <w:numFmt w:val="decimal"/>
-      <w:pStyle w:val="Heading4"/>
+      <w:pStyle w:val="Otsikko4"/>
       <w:lvlText w:val="%1.%2.%3.%4"/>
       <w:lvlJc w:val="left"/>
       <w:pPr>
@@ -1961,7 +1824,7 @@
     <w:lvl w:ilvl="4">
       <w:start w:val="1"/>
       <w:numFmt w:val="decimal"/>
-      <w:pStyle w:val="Heading5"/>
+      <w:pStyle w:val="Otsikko5"/>
       <w:lvlText w:val="%1.%2.%3.%4.%5"/>
       <w:lvlJc w:val="left"/>
       <w:pPr>
@@ -1974,7 +1837,7 @@
     <w:lvl w:ilvl="5">
       <w:start w:val="1"/>
       <w:numFmt w:val="decimal"/>
-      <w:pStyle w:val="Heading6"/>
+      <w:pStyle w:val="Otsikko6"/>
       <w:lvlText w:val="%1.%2.%3.%4.%5.%6"/>
       <w:lvlJc w:val="left"/>
       <w:pPr>
@@ -1987,7 +1850,7 @@
     <w:lvl w:ilvl="6">
       <w:start w:val="1"/>
       <w:numFmt w:val="decimal"/>
-      <w:pStyle w:val="Heading7"/>
+      <w:pStyle w:val="Otsikko7"/>
       <w:lvlText w:val="%1.%2.%3.%4.%5.%6.%7"/>
       <w:lvlJc w:val="left"/>
       <w:pPr>
@@ -2000,7 +1863,7 @@
     <w:lvl w:ilvl="7">
       <w:start w:val="1"/>
       <w:numFmt w:val="decimal"/>
-      <w:pStyle w:val="Heading8"/>
+      <w:pStyle w:val="Otsikko8"/>
       <w:lvlText w:val="%1.%2.%3.%4.%5.%6.%7.%8"/>
       <w:lvlJc w:val="left"/>
       <w:pPr>
@@ -2013,7 +1876,7 @@
     <w:lvl w:ilvl="8">
       <w:start w:val="1"/>
       <w:numFmt w:val="decimal"/>
-      <w:pStyle w:val="Heading9"/>
+      <w:pStyle w:val="Otsikko9"/>
       <w:lvlText w:val="%1.%2.%3.%4.%5.%6.%7.%8.%9"/>
       <w:lvlJc w:val="left"/>
       <w:pPr>
@@ -2052,7 +1915,7 @@
 </file>
 
 <file path=word/styles.xml><?xml version="1.0" encoding="utf-8"?>
-<w:styles xmlns:mc="http://schemas.openxmlformats.org/markup-compatibility/2006" xmlns:r="http://schemas.openxmlformats.org/officeDocument/2006/relationships" xmlns:w="http://schemas.openxmlformats.org/wordprocessingml/2006/main" xmlns:w14="http://schemas.microsoft.com/office/word/2010/wordml" xmlns:w15="http://schemas.microsoft.com/office/word/2012/wordml" xmlns:w16cex="http://schemas.microsoft.com/office/word/2018/wordml/cex" xmlns:w16cid="http://schemas.microsoft.com/office/word/2016/wordml/cid" xmlns:w16="http://schemas.microsoft.com/office/word/2018/wordml" xmlns:w16sdtdh="http://schemas.microsoft.com/office/word/2020/wordml/sdtdatahash" xmlns:w16se="http://schemas.microsoft.com/office/word/2015/wordml/symex" mc:Ignorable="w14 w15 w16se w16cid w16 w16cex w16sdtdh">
+<w:styles xmlns:mc="http://schemas.openxmlformats.org/markup-compatibility/2006" xmlns:r="http://schemas.openxmlformats.org/officeDocument/2006/relationships" xmlns:w="http://schemas.openxmlformats.org/wordprocessingml/2006/main" xmlns:w14="http://schemas.microsoft.com/office/word/2010/wordml" xmlns:w15="http://schemas.microsoft.com/office/word/2012/wordml" xmlns:w16cex="http://schemas.microsoft.com/office/word/2018/wordml/cex" xmlns:w16cid="http://schemas.microsoft.com/office/word/2016/wordml/cid" xmlns:w16="http://schemas.microsoft.com/office/word/2018/wordml" xmlns:w16du="http://schemas.microsoft.com/office/word/2023/wordml/word16du" xmlns:w16sdtdh="http://schemas.microsoft.com/office/word/2020/wordml/sdtdatahash" xmlns:w16sdtfl="http://schemas.microsoft.com/office/word/2024/wordml/sdtformatlock" xmlns:w16se="http://schemas.microsoft.com/office/word/2015/wordml/symex" mc:Ignorable="w14 w15 w16se w16cid w16 w16cex w16sdtdh w16sdtfl w16du">
   <w:docDefaults>
     <w:rPrDefault>
       <w:rPr>
@@ -2079,6 +1942,7 @@
     <w:lsdException w:name="Strong" w:qFormat="1"/>
     <w:lsdException w:name="Emphasis" w:qFormat="1"/>
     <w:lsdException w:name="HTML Variable" w:semiHidden="1" w:unhideWhenUsed="1"/>
+    <w:lsdException w:name="Normal Table" w:semiHidden="1" w:unhideWhenUsed="1"/>
     <w:lsdException w:name="Outline List 3" w:semiHidden="1" w:unhideWhenUsed="1"/>
     <w:lsdException w:name="Table Simple 1" w:semiHidden="1" w:unhideWhenUsed="1"/>
     <w:lsdException w:name="Table Simple 2" w:semiHidden="1" w:unhideWhenUsed="1"/>
@@ -2121,7 +1985,9 @@
     <w:lsdException w:name="Table Subtle 2" w:semiHidden="1" w:unhideWhenUsed="1"/>
     <w:lsdException w:name="Table Web 1" w:semiHidden="1" w:unhideWhenUsed="1"/>
     <w:lsdException w:name="Table Web 2" w:semiHidden="1" w:unhideWhenUsed="1"/>
+    <w:lsdException w:name="Table Web 3" w:semiHidden="1" w:unhideWhenUsed="1"/>
     <w:lsdException w:name="Balloon Text" w:semiHidden="1" w:unhideWhenUsed="1"/>
+    <w:lsdException w:name="Table Theme" w:semiHidden="1" w:unhideWhenUsed="1"/>
     <w:lsdException w:name="Placeholder Text" w:semiHidden="1" w:uiPriority="99"/>
     <w:lsdException w:name="No Spacing" w:uiPriority="1" w:qFormat="1"/>
     <w:lsdException w:name="Light Shading" w:uiPriority="60"/>
@@ -2343,7 +2209,7 @@
     <w:lsdException w:name="Unresolved Mention" w:semiHidden="1" w:uiPriority="99" w:unhideWhenUsed="1"/>
     <w:lsdException w:name="Smart Link" w:semiHidden="1" w:uiPriority="99" w:unhideWhenUsed="1"/>
   </w:latentStyles>
-  <w:style w:type="paragraph" w:default="1" w:styleId="Normal">
+  <w:style w:type="paragraph" w:default="1" w:styleId="Normaali">
     <w:name w:val="Normal"/>
     <w:qFormat/>
     <w:rPr>
@@ -2352,10 +2218,10 @@
       <w:lang w:val="fi-FI"/>
     </w:rPr>
   </w:style>
-  <w:style w:type="paragraph" w:styleId="Heading1">
+  <w:style w:type="paragraph" w:styleId="Otsikko1">
     <w:name w:val="heading 1"/>
-    <w:basedOn w:val="Normal"/>
-    <w:next w:val="Normal"/>
+    <w:basedOn w:val="Normaali"/>
+    <w:next w:val="Normaali"/>
     <w:qFormat/>
     <w:pPr>
       <w:keepNext/>
@@ -2375,10 +2241,10 @@
       <w:szCs w:val="32"/>
     </w:rPr>
   </w:style>
-  <w:style w:type="paragraph" w:styleId="Heading2">
+  <w:style w:type="paragraph" w:styleId="Otsikko2">
     <w:name w:val="heading 2"/>
-    <w:basedOn w:val="Normal"/>
-    <w:next w:val="Normal"/>
+    <w:basedOn w:val="Normaali"/>
+    <w:next w:val="Normaali"/>
     <w:qFormat/>
     <w:pPr>
       <w:keepNext/>
@@ -2397,10 +2263,10 @@
       <w:szCs w:val="26"/>
     </w:rPr>
   </w:style>
-  <w:style w:type="paragraph" w:styleId="Heading3">
+  <w:style w:type="paragraph" w:styleId="Otsikko3">
     <w:name w:val="heading 3"/>
-    <w:basedOn w:val="Normal"/>
-    <w:next w:val="Normal"/>
+    <w:basedOn w:val="Normaali"/>
+    <w:next w:val="Normaali"/>
     <w:qFormat/>
     <w:pPr>
       <w:keepNext/>
@@ -2415,10 +2281,10 @@
       <w:bCs/>
     </w:rPr>
   </w:style>
-  <w:style w:type="paragraph" w:styleId="Heading4">
+  <w:style w:type="paragraph" w:styleId="Otsikko4">
     <w:name w:val="heading 4"/>
-    <w:basedOn w:val="Normal"/>
-    <w:next w:val="Normal"/>
+    <w:basedOn w:val="Normaali"/>
+    <w:next w:val="Normaali"/>
     <w:qFormat/>
     <w:pPr>
       <w:keepNext/>
@@ -2435,10 +2301,10 @@
       <w:szCs w:val="26"/>
     </w:rPr>
   </w:style>
-  <w:style w:type="paragraph" w:styleId="Heading5">
+  <w:style w:type="paragraph" w:styleId="Otsikko5">
     <w:name w:val="heading 5"/>
-    <w:basedOn w:val="Normal"/>
-    <w:next w:val="Normal"/>
+    <w:basedOn w:val="Normaali"/>
+    <w:next w:val="Normaali"/>
     <w:qFormat/>
     <w:pPr>
       <w:keepNext/>
@@ -2455,10 +2321,10 @@
       <w:szCs w:val="32"/>
     </w:rPr>
   </w:style>
-  <w:style w:type="paragraph" w:styleId="Heading6">
+  <w:style w:type="paragraph" w:styleId="Otsikko6">
     <w:name w:val="heading 6"/>
-    <w:basedOn w:val="Normal"/>
-    <w:next w:val="Normal"/>
+    <w:basedOn w:val="Normaali"/>
+    <w:next w:val="Normaali"/>
     <w:qFormat/>
     <w:pPr>
       <w:keepNext/>
@@ -2475,10 +2341,10 @@
       <w:szCs w:val="28"/>
     </w:rPr>
   </w:style>
-  <w:style w:type="paragraph" w:styleId="Heading7">
+  <w:style w:type="paragraph" w:styleId="Otsikko7">
     <w:name w:val="heading 7"/>
-    <w:basedOn w:val="Normal"/>
-    <w:next w:val="Normal"/>
+    <w:basedOn w:val="Normaali"/>
+    <w:next w:val="Normaali"/>
     <w:qFormat/>
     <w:pPr>
       <w:numPr>
@@ -2489,10 +2355,10 @@
       <w:outlineLvl w:val="6"/>
     </w:pPr>
   </w:style>
-  <w:style w:type="paragraph" w:styleId="Heading8">
+  <w:style w:type="paragraph" w:styleId="Otsikko8">
     <w:name w:val="heading 8"/>
-    <w:basedOn w:val="Normal"/>
-    <w:next w:val="Normal"/>
+    <w:basedOn w:val="Normaali"/>
+    <w:next w:val="Normaali"/>
     <w:qFormat/>
     <w:pPr>
       <w:numPr>
@@ -2507,10 +2373,10 @@
       <w:iCs/>
     </w:rPr>
   </w:style>
-  <w:style w:type="paragraph" w:styleId="Heading9">
+  <w:style w:type="paragraph" w:styleId="Otsikko9">
     <w:name w:val="heading 9"/>
-    <w:basedOn w:val="Normal"/>
-    <w:next w:val="Normal"/>
+    <w:basedOn w:val="Normaali"/>
+    <w:next w:val="Normaali"/>
     <w:qFormat/>
     <w:pPr>
       <w:numPr>
@@ -2526,13 +2392,13 @@
       <w:szCs w:val="22"/>
     </w:rPr>
   </w:style>
-  <w:style w:type="character" w:default="1" w:styleId="DefaultParagraphFont">
+  <w:style w:type="character" w:default="1" w:styleId="Kappaleenoletusfontti">
     <w:name w:val="Default Paragraph Font"/>
     <w:uiPriority w:val="1"/>
     <w:semiHidden/>
     <w:unhideWhenUsed/>
   </w:style>
-  <w:style w:type="table" w:default="1" w:styleId="TableNormal">
+  <w:style w:type="table" w:default="1" w:styleId="Normaalitaulukko">
     <w:name w:val="Normal Table"/>
     <w:uiPriority w:val="99"/>
     <w:semiHidden/>
@@ -2547,128 +2413,128 @@
       </w:tblCellMar>
     </w:tblPr>
   </w:style>
-  <w:style w:type="numbering" w:default="1" w:styleId="NoList">
+  <w:style w:type="numbering" w:default="1" w:styleId="Eiluetteloa">
     <w:name w:val="No List"/>
     <w:uiPriority w:val="99"/>
     <w:semiHidden/>
     <w:unhideWhenUsed/>
   </w:style>
-  <w:style w:type="paragraph" w:styleId="BodyText">
+  <w:style w:type="paragraph" w:styleId="Leipteksti">
     <w:name w:val="Body Text"/>
-    <w:basedOn w:val="Normal"/>
-    <w:link w:val="BodyTextChar"/>
+    <w:basedOn w:val="Normaali"/>
+    <w:link w:val="LeiptekstiChar"/>
     <w:pPr>
       <w:spacing w:line="360" w:lineRule="auto"/>
       <w:jc w:val="both"/>
     </w:pPr>
   </w:style>
-  <w:style w:type="character" w:styleId="Hyperlink">
+  <w:style w:type="character" w:styleId="Hyperlinkki">
     <w:name w:val="Hyperlink"/>
     <w:rPr>
       <w:color w:val="0000FF"/>
       <w:u w:val="single"/>
     </w:rPr>
   </w:style>
-  <w:style w:type="paragraph" w:styleId="Index1">
+  <w:style w:type="paragraph" w:styleId="Hakemisto1">
     <w:name w:val="index 1"/>
-    <w:basedOn w:val="Normal"/>
-    <w:next w:val="Normal"/>
+    <w:basedOn w:val="Normaali"/>
+    <w:next w:val="Normaali"/>
     <w:autoRedefine/>
     <w:semiHidden/>
     <w:pPr>
       <w:ind w:left="240" w:hanging="240"/>
     </w:pPr>
   </w:style>
-  <w:style w:type="paragraph" w:styleId="Index2">
+  <w:style w:type="paragraph" w:styleId="Hakemisto2">
     <w:name w:val="index 2"/>
-    <w:basedOn w:val="Normal"/>
-    <w:next w:val="Normal"/>
+    <w:basedOn w:val="Normaali"/>
+    <w:next w:val="Normaali"/>
     <w:autoRedefine/>
     <w:semiHidden/>
     <w:pPr>
       <w:ind w:left="480" w:hanging="240"/>
     </w:pPr>
   </w:style>
-  <w:style w:type="paragraph" w:styleId="Index3">
+  <w:style w:type="paragraph" w:styleId="Hakemisto3">
     <w:name w:val="index 3"/>
-    <w:basedOn w:val="Normal"/>
-    <w:next w:val="Normal"/>
+    <w:basedOn w:val="Normaali"/>
+    <w:next w:val="Normaali"/>
     <w:autoRedefine/>
     <w:semiHidden/>
     <w:pPr>
       <w:ind w:left="720" w:hanging="240"/>
     </w:pPr>
   </w:style>
-  <w:style w:type="paragraph" w:styleId="Index4">
+  <w:style w:type="paragraph" w:styleId="Hakemisto4">
     <w:name w:val="index 4"/>
-    <w:basedOn w:val="Normal"/>
-    <w:next w:val="Normal"/>
+    <w:basedOn w:val="Normaali"/>
+    <w:next w:val="Normaali"/>
     <w:autoRedefine/>
     <w:semiHidden/>
     <w:pPr>
       <w:ind w:left="960" w:hanging="240"/>
     </w:pPr>
   </w:style>
-  <w:style w:type="paragraph" w:styleId="Index5">
+  <w:style w:type="paragraph" w:styleId="Hakemisto5">
     <w:name w:val="index 5"/>
-    <w:basedOn w:val="Normal"/>
-    <w:next w:val="Normal"/>
+    <w:basedOn w:val="Normaali"/>
+    <w:next w:val="Normaali"/>
     <w:autoRedefine/>
     <w:semiHidden/>
     <w:pPr>
       <w:ind w:left="1200" w:hanging="240"/>
     </w:pPr>
   </w:style>
-  <w:style w:type="paragraph" w:styleId="Index6">
+  <w:style w:type="paragraph" w:styleId="Hakemisto6">
     <w:name w:val="index 6"/>
-    <w:basedOn w:val="Normal"/>
-    <w:next w:val="Normal"/>
+    <w:basedOn w:val="Normaali"/>
+    <w:next w:val="Normaali"/>
     <w:autoRedefine/>
     <w:semiHidden/>
     <w:pPr>
       <w:ind w:left="1440" w:hanging="240"/>
     </w:pPr>
   </w:style>
-  <w:style w:type="paragraph" w:styleId="Index7">
+  <w:style w:type="paragraph" w:styleId="Hakemisto7">
     <w:name w:val="index 7"/>
-    <w:basedOn w:val="Normal"/>
-    <w:next w:val="Normal"/>
+    <w:basedOn w:val="Normaali"/>
+    <w:next w:val="Normaali"/>
     <w:autoRedefine/>
     <w:semiHidden/>
     <w:pPr>
       <w:ind w:left="1680" w:hanging="240"/>
     </w:pPr>
   </w:style>
-  <w:style w:type="paragraph" w:styleId="Index8">
+  <w:style w:type="paragraph" w:styleId="Hakemisto8">
     <w:name w:val="index 8"/>
-    <w:basedOn w:val="Normal"/>
-    <w:next w:val="Normal"/>
+    <w:basedOn w:val="Normaali"/>
+    <w:next w:val="Normaali"/>
     <w:autoRedefine/>
     <w:semiHidden/>
     <w:pPr>
       <w:ind w:left="1920" w:hanging="240"/>
     </w:pPr>
   </w:style>
-  <w:style w:type="paragraph" w:styleId="Index9">
+  <w:style w:type="paragraph" w:styleId="Hakemisto9">
     <w:name w:val="index 9"/>
-    <w:basedOn w:val="Normal"/>
-    <w:next w:val="Normal"/>
+    <w:basedOn w:val="Normaali"/>
+    <w:next w:val="Normaali"/>
     <w:autoRedefine/>
     <w:semiHidden/>
     <w:pPr>
       <w:ind w:left="2160" w:hanging="240"/>
     </w:pPr>
   </w:style>
-  <w:style w:type="paragraph" w:styleId="IndexHeading">
+  <w:style w:type="paragraph" w:styleId="Hakemistonotsikko">
     <w:name w:val="index heading"/>
-    <w:basedOn w:val="Normal"/>
-    <w:next w:val="Index1"/>
+    <w:basedOn w:val="Normaali"/>
+    <w:next w:val="Hakemisto1"/>
     <w:semiHidden/>
   </w:style>
-  <w:style w:type="paragraph" w:styleId="TOC1">
+  <w:style w:type="paragraph" w:styleId="Sisluet1">
     <w:name w:val="toc 1"/>
-    <w:basedOn w:val="Normal"/>
-    <w:next w:val="Normal"/>
+    <w:basedOn w:val="Normaali"/>
+    <w:next w:val="Normaali"/>
     <w:autoRedefine/>
     <w:semiHidden/>
     <w:rsid w:val="009403CA"/>
@@ -2687,10 +2553,10 @@
       <w:noProof/>
     </w:rPr>
   </w:style>
-  <w:style w:type="paragraph" w:styleId="TOC2">
+  <w:style w:type="paragraph" w:styleId="Sisluet2">
     <w:name w:val="toc 2"/>
-    <w:basedOn w:val="Normal"/>
-    <w:next w:val="Normal"/>
+    <w:basedOn w:val="Normaali"/>
+    <w:next w:val="Normaali"/>
     <w:autoRedefine/>
     <w:semiHidden/>
     <w:rsid w:val="009403CA"/>
@@ -2706,10 +2572,10 @@
       <w:smallCaps/>
     </w:rPr>
   </w:style>
-  <w:style w:type="paragraph" w:styleId="TOC3">
+  <w:style w:type="paragraph" w:styleId="Sisluet3">
     <w:name w:val="toc 3"/>
-    <w:basedOn w:val="Normal"/>
-    <w:next w:val="Normal"/>
+    <w:basedOn w:val="Normaali"/>
+    <w:next w:val="Normaali"/>
     <w:autoRedefine/>
     <w:semiHidden/>
     <w:pPr>
@@ -2720,69 +2586,69 @@
       <w:iCs/>
     </w:rPr>
   </w:style>
-  <w:style w:type="paragraph" w:styleId="TOC4">
+  <w:style w:type="paragraph" w:styleId="Sisluet4">
     <w:name w:val="toc 4"/>
-    <w:basedOn w:val="Normal"/>
-    <w:next w:val="Normal"/>
+    <w:basedOn w:val="Normaali"/>
+    <w:next w:val="Normaali"/>
     <w:autoRedefine/>
     <w:semiHidden/>
     <w:pPr>
       <w:ind w:left="720"/>
     </w:pPr>
   </w:style>
-  <w:style w:type="paragraph" w:styleId="TOC5">
+  <w:style w:type="paragraph" w:styleId="Sisluet5">
     <w:name w:val="toc 5"/>
-    <w:basedOn w:val="Normal"/>
-    <w:next w:val="Normal"/>
+    <w:basedOn w:val="Normaali"/>
+    <w:next w:val="Normaali"/>
     <w:autoRedefine/>
     <w:semiHidden/>
     <w:pPr>
       <w:ind w:left="960"/>
     </w:pPr>
   </w:style>
-  <w:style w:type="paragraph" w:styleId="TOC6">
+  <w:style w:type="paragraph" w:styleId="Sisluet6">
     <w:name w:val="toc 6"/>
-    <w:basedOn w:val="Normal"/>
-    <w:next w:val="Normal"/>
+    <w:basedOn w:val="Normaali"/>
+    <w:next w:val="Normaali"/>
     <w:autoRedefine/>
     <w:semiHidden/>
     <w:pPr>
       <w:ind w:left="1200"/>
     </w:pPr>
   </w:style>
-  <w:style w:type="paragraph" w:styleId="TOC7">
+  <w:style w:type="paragraph" w:styleId="Sisluet7">
     <w:name w:val="toc 7"/>
-    <w:basedOn w:val="Normal"/>
-    <w:next w:val="Normal"/>
+    <w:basedOn w:val="Normaali"/>
+    <w:next w:val="Normaali"/>
     <w:autoRedefine/>
     <w:semiHidden/>
     <w:pPr>
       <w:ind w:left="1440"/>
     </w:pPr>
   </w:style>
-  <w:style w:type="paragraph" w:styleId="TOC8">
+  <w:style w:type="paragraph" w:styleId="Sisluet8">
     <w:name w:val="toc 8"/>
-    <w:basedOn w:val="Normal"/>
-    <w:next w:val="Normal"/>
+    <w:basedOn w:val="Normaali"/>
+    <w:next w:val="Normaali"/>
     <w:autoRedefine/>
     <w:semiHidden/>
     <w:pPr>
       <w:ind w:left="1680"/>
     </w:pPr>
   </w:style>
-  <w:style w:type="paragraph" w:styleId="TOC9">
+  <w:style w:type="paragraph" w:styleId="Sisluet9">
     <w:name w:val="toc 9"/>
-    <w:basedOn w:val="Normal"/>
-    <w:next w:val="Normal"/>
+    <w:basedOn w:val="Normaali"/>
+    <w:next w:val="Normaali"/>
     <w:autoRedefine/>
     <w:semiHidden/>
     <w:pPr>
       <w:ind w:left="1920"/>
     </w:pPr>
   </w:style>
-  <w:style w:type="paragraph" w:styleId="Footer">
+  <w:style w:type="paragraph" w:styleId="Alatunniste">
     <w:name w:val="footer"/>
-    <w:basedOn w:val="Normal"/>
+    <w:basedOn w:val="Normaali"/>
     <w:pPr>
       <w:tabs>
         <w:tab w:val="center" w:pos="4819"/>
@@ -2790,13 +2656,13 @@
       </w:tabs>
     </w:pPr>
   </w:style>
-  <w:style w:type="character" w:styleId="PageNumber">
+  <w:style w:type="character" w:styleId="Sivunumero">
     <w:name w:val="page number"/>
-    <w:basedOn w:val="DefaultParagraphFont"/>
-  </w:style>
-  <w:style w:type="paragraph" w:styleId="Header">
+    <w:basedOn w:val="Kappaleenoletusfontti"/>
+  </w:style>
+  <w:style w:type="paragraph" w:styleId="Yltunniste">
     <w:name w:val="header"/>
-    <w:basedOn w:val="Normal"/>
+    <w:basedOn w:val="Normaali"/>
     <w:pPr>
       <w:tabs>
         <w:tab w:val="center" w:pos="4819"/>
@@ -2804,10 +2670,10 @@
       </w:tabs>
     </w:pPr>
   </w:style>
-  <w:style w:type="paragraph" w:styleId="Title">
+  <w:style w:type="paragraph" w:styleId="Otsikko">
     <w:name w:val="Title"/>
-    <w:basedOn w:val="Normal"/>
-    <w:link w:val="TitleChar"/>
+    <w:basedOn w:val="Normaali"/>
+    <w:link w:val="OtsikkoChar"/>
     <w:qFormat/>
     <w:pPr>
       <w:spacing w:line="360" w:lineRule="auto"/>
@@ -2821,16 +2687,16 @@
       <w:szCs w:val="28"/>
     </w:rPr>
   </w:style>
-  <w:style w:type="paragraph" w:styleId="PlainText">
+  <w:style w:type="paragraph" w:styleId="Vaintekstin">
     <w:name w:val="Plain Text"/>
-    <w:basedOn w:val="Normal"/>
+    <w:basedOn w:val="Normaali"/>
     <w:rPr>
       <w:rFonts w:ascii="Courier New" w:hAnsi="Courier New" w:cs="Courier New"/>
       <w:sz w:val="20"/>
       <w:szCs w:val="20"/>
     </w:rPr>
   </w:style>
-  <w:style w:type="character" w:styleId="FollowedHyperlink">
+  <w:style w:type="character" w:styleId="AvattuHyperlinkki">
     <w:name w:val="FollowedHyperlink"/>
     <w:rPr>
       <w:color w:val="800080"/>
@@ -2853,7 +2719,7 @@
   </w:style>
   <w:style w:type="paragraph" w:customStyle="1" w:styleId="font5">
     <w:name w:val="font5"/>
-    <w:basedOn w:val="Normal"/>
+    <w:basedOn w:val="Normaali"/>
     <w:pPr>
       <w:spacing w:before="100" w:beforeAutospacing="1" w:after="100" w:afterAutospacing="1"/>
     </w:pPr>
@@ -2867,7 +2733,7 @@
   </w:style>
   <w:style w:type="paragraph" w:customStyle="1" w:styleId="font6">
     <w:name w:val="font6"/>
-    <w:basedOn w:val="Normal"/>
+    <w:basedOn w:val="Normaali"/>
     <w:pPr>
       <w:spacing w:before="100" w:beforeAutospacing="1" w:after="100" w:afterAutospacing="1"/>
     </w:pPr>
@@ -2879,7 +2745,7 @@
   </w:style>
   <w:style w:type="paragraph" w:customStyle="1" w:styleId="xl24">
     <w:name w:val="xl24"/>
-    <w:basedOn w:val="Normal"/>
+    <w:basedOn w:val="Normaali"/>
     <w:pPr>
       <w:pBdr>
         <w:left w:val="single" w:sz="4" w:space="0" w:color="auto"/>
@@ -2897,7 +2763,7 @@
   </w:style>
   <w:style w:type="paragraph" w:customStyle="1" w:styleId="xl25">
     <w:name w:val="xl25"/>
-    <w:basedOn w:val="Normal"/>
+    <w:basedOn w:val="Normaali"/>
     <w:pPr>
       <w:shd w:val="clear" w:color="auto" w:fill="FFFFFF"/>
       <w:spacing w:before="100" w:beforeAutospacing="1" w:after="100" w:afterAutospacing="1"/>
@@ -2912,7 +2778,7 @@
   </w:style>
   <w:style w:type="paragraph" w:customStyle="1" w:styleId="xl26">
     <w:name w:val="xl26"/>
-    <w:basedOn w:val="Normal"/>
+    <w:basedOn w:val="Normaali"/>
     <w:pPr>
       <w:pBdr>
         <w:left w:val="single" w:sz="4" w:space="0" w:color="auto"/>
@@ -2922,7 +2788,7 @@
   </w:style>
   <w:style w:type="paragraph" w:customStyle="1" w:styleId="xl27">
     <w:name w:val="xl27"/>
-    <w:basedOn w:val="Normal"/>
+    <w:basedOn w:val="Normaali"/>
     <w:pPr>
       <w:pBdr>
         <w:right w:val="single" w:sz="4" w:space="0" w:color="auto"/>
@@ -2932,7 +2798,7 @@
   </w:style>
   <w:style w:type="paragraph" w:customStyle="1" w:styleId="xl28">
     <w:name w:val="xl28"/>
-    <w:basedOn w:val="Normal"/>
+    <w:basedOn w:val="Normaali"/>
     <w:pPr>
       <w:spacing w:before="100" w:beforeAutospacing="1" w:after="100" w:afterAutospacing="1"/>
       <w:jc w:val="center"/>
@@ -2945,7 +2811,7 @@
   </w:style>
   <w:style w:type="paragraph" w:customStyle="1" w:styleId="xl29">
     <w:name w:val="xl29"/>
-    <w:basedOn w:val="Normal"/>
+    <w:basedOn w:val="Normaali"/>
     <w:pPr>
       <w:pBdr>
         <w:left w:val="single" w:sz="4" w:space="0" w:color="auto"/>
@@ -2956,7 +2822,7 @@
   </w:style>
   <w:style w:type="paragraph" w:customStyle="1" w:styleId="xl30">
     <w:name w:val="xl30"/>
-    <w:basedOn w:val="Normal"/>
+    <w:basedOn w:val="Normaali"/>
     <w:pPr>
       <w:shd w:val="clear" w:color="auto" w:fill="FFFFFF"/>
       <w:spacing w:before="100" w:beforeAutospacing="1" w:after="100" w:afterAutospacing="1"/>
@@ -2970,7 +2836,7 @@
   </w:style>
   <w:style w:type="paragraph" w:customStyle="1" w:styleId="xl31">
     <w:name w:val="xl31"/>
-    <w:basedOn w:val="Normal"/>
+    <w:basedOn w:val="Normaali"/>
     <w:pPr>
       <w:shd w:val="clear" w:color="auto" w:fill="FFFFFF"/>
       <w:spacing w:before="100" w:beforeAutospacing="1" w:after="100" w:afterAutospacing="1"/>
@@ -2978,7 +2844,7 @@
   </w:style>
   <w:style w:type="paragraph" w:customStyle="1" w:styleId="xl32">
     <w:name w:val="xl32"/>
-    <w:basedOn w:val="Normal"/>
+    <w:basedOn w:val="Normaali"/>
     <w:pPr>
       <w:shd w:val="clear" w:color="auto" w:fill="FFFFFF"/>
       <w:spacing w:before="100" w:beforeAutospacing="1" w:after="100" w:afterAutospacing="1"/>
@@ -2992,7 +2858,7 @@
   </w:style>
   <w:style w:type="paragraph" w:customStyle="1" w:styleId="xl33">
     <w:name w:val="xl33"/>
-    <w:basedOn w:val="Normal"/>
+    <w:basedOn w:val="Normaali"/>
     <w:pPr>
       <w:pBdr>
         <w:right w:val="single" w:sz="4" w:space="0" w:color="auto"/>
@@ -3003,7 +2869,7 @@
   </w:style>
   <w:style w:type="paragraph" w:customStyle="1" w:styleId="xl34">
     <w:name w:val="xl34"/>
-    <w:basedOn w:val="Normal"/>
+    <w:basedOn w:val="Normaali"/>
     <w:pPr>
       <w:shd w:val="clear" w:color="auto" w:fill="333333"/>
       <w:spacing w:before="100" w:beforeAutospacing="1" w:after="100" w:afterAutospacing="1"/>
@@ -3018,7 +2884,7 @@
   </w:style>
   <w:style w:type="paragraph" w:customStyle="1" w:styleId="xl35">
     <w:name w:val="xl35"/>
-    <w:basedOn w:val="Normal"/>
+    <w:basedOn w:val="Normaali"/>
     <w:pPr>
       <w:pBdr>
         <w:left w:val="single" w:sz="4" w:space="0" w:color="auto"/>
@@ -3035,7 +2901,7 @@
   </w:style>
   <w:style w:type="paragraph" w:customStyle="1" w:styleId="xl36">
     <w:name w:val="xl36"/>
-    <w:basedOn w:val="Normal"/>
+    <w:basedOn w:val="Normaali"/>
     <w:pPr>
       <w:shd w:val="clear" w:color="auto" w:fill="333333"/>
       <w:spacing w:before="100" w:beforeAutospacing="1" w:after="100" w:afterAutospacing="1"/>
@@ -3049,7 +2915,7 @@
   </w:style>
   <w:style w:type="paragraph" w:customStyle="1" w:styleId="xl37">
     <w:name w:val="xl37"/>
-    <w:basedOn w:val="Normal"/>
+    <w:basedOn w:val="Normaali"/>
     <w:pPr>
       <w:pBdr>
         <w:left w:val="single" w:sz="4" w:space="0" w:color="auto"/>
@@ -3060,7 +2926,7 @@
   </w:style>
   <w:style w:type="paragraph" w:customStyle="1" w:styleId="xl38">
     <w:name w:val="xl38"/>
-    <w:basedOn w:val="Normal"/>
+    <w:basedOn w:val="Normaali"/>
     <w:pPr>
       <w:shd w:val="clear" w:color="auto" w:fill="333333"/>
       <w:spacing w:before="100" w:beforeAutospacing="1" w:after="100" w:afterAutospacing="1"/>
@@ -3068,7 +2934,7 @@
   </w:style>
   <w:style w:type="paragraph" w:customStyle="1" w:styleId="xl39">
     <w:name w:val="xl39"/>
-    <w:basedOn w:val="Normal"/>
+    <w:basedOn w:val="Normaali"/>
     <w:pPr>
       <w:pBdr>
         <w:right w:val="single" w:sz="4" w:space="0" w:color="auto"/>
@@ -3077,15 +2943,15 @@
       <w:spacing w:before="100" w:beforeAutospacing="1" w:after="100" w:afterAutospacing="1"/>
     </w:pPr>
   </w:style>
-  <w:style w:type="paragraph" w:styleId="Date">
+  <w:style w:type="paragraph" w:styleId="Pivmr">
     <w:name w:val="Date"/>
-    <w:basedOn w:val="Normal"/>
-    <w:next w:val="Normal"/>
+    <w:basedOn w:val="Normaali"/>
+    <w:next w:val="Normaali"/>
     <w:rsid w:val="00166D0D"/>
   </w:style>
   <w:style w:type="paragraph" w:customStyle="1" w:styleId="Style1">
     <w:name w:val="Style1"/>
-    <w:basedOn w:val="Heading3"/>
+    <w:basedOn w:val="Otsikko3"/>
     <w:autoRedefine/>
     <w:rsid w:val="00E405A1"/>
     <w:pPr>
@@ -3095,9 +2961,9 @@
       <w:rFonts w:ascii="Arial" w:hAnsi="Arial"/>
     </w:rPr>
   </w:style>
-  <w:style w:type="table" w:styleId="TableGrid">
+  <w:style w:type="table" w:styleId="TaulukkoRuudukko">
     <w:name w:val="Table Grid"/>
-    <w:basedOn w:val="TableNormal"/>
+    <w:basedOn w:val="Normaalitaulukko"/>
     <w:rsid w:val="008A5436"/>
     <w:tblPr>
       <w:tblBorders>
@@ -3110,9 +2976,9 @@
       </w:tblBorders>
     </w:tblPr>
   </w:style>
-  <w:style w:type="character" w:customStyle="1" w:styleId="BodyTextChar">
-    <w:name w:val="Body Text Char"/>
-    <w:link w:val="BodyText"/>
+  <w:style w:type="character" w:customStyle="1" w:styleId="LeiptekstiChar">
+    <w:name w:val="Leipäteksti Char"/>
+    <w:link w:val="Leipteksti"/>
     <w:rsid w:val="00154C31"/>
     <w:rPr>
       <w:sz w:val="24"/>
@@ -3120,7 +2986,7 @@
       <w:lang w:val="fi-FI" w:eastAsia="en-US" w:bidi="ar-SA"/>
     </w:rPr>
   </w:style>
-  <w:style w:type="character" w:styleId="Emphasis">
+  <w:style w:type="character" w:styleId="Korostus">
     <w:name w:val="Emphasis"/>
     <w:qFormat/>
     <w:rsid w:val="00497E28"/>
@@ -3129,10 +2995,10 @@
       <w:iCs/>
     </w:rPr>
   </w:style>
-  <w:style w:type="paragraph" w:styleId="BalloonText">
+  <w:style w:type="paragraph" w:styleId="Seliteteksti">
     <w:name w:val="Balloon Text"/>
-    <w:basedOn w:val="Normal"/>
-    <w:link w:val="BalloonTextChar"/>
+    <w:basedOn w:val="Normaali"/>
+    <w:link w:val="SelitetekstiChar"/>
     <w:rsid w:val="00E83372"/>
     <w:rPr>
       <w:rFonts w:ascii="Tahoma" w:hAnsi="Tahoma" w:cs="Tahoma"/>
@@ -3140,9 +3006,9 @@
       <w:szCs w:val="16"/>
     </w:rPr>
   </w:style>
-  <w:style w:type="character" w:customStyle="1" w:styleId="BalloonTextChar">
-    <w:name w:val="Balloon Text Char"/>
-    <w:link w:val="BalloonText"/>
+  <w:style w:type="character" w:customStyle="1" w:styleId="SelitetekstiChar">
+    <w:name w:val="Seliteteksti Char"/>
+    <w:link w:val="Seliteteksti"/>
     <w:rsid w:val="00E83372"/>
     <w:rPr>
       <w:rFonts w:ascii="Tahoma" w:hAnsi="Tahoma" w:cs="Tahoma"/>
@@ -3151,10 +3017,10 @@
       <w:lang w:eastAsia="en-US"/>
     </w:rPr>
   </w:style>
-  <w:style w:type="character" w:customStyle="1" w:styleId="TitleChar">
-    <w:name w:val="Title Char"/>
-    <w:basedOn w:val="DefaultParagraphFont"/>
-    <w:link w:val="Title"/>
+  <w:style w:type="character" w:customStyle="1" w:styleId="OtsikkoChar">
+    <w:name w:val="Otsikko Char"/>
+    <w:basedOn w:val="Kappaleenoletusfontti"/>
+    <w:link w:val="Otsikko"/>
     <w:rsid w:val="005817C9"/>
     <w:rPr>
       <w:rFonts w:ascii="Arial" w:hAnsi="Arial" w:cs="Arial"/>
@@ -3464,15 +3330,6 @@
 </file>
 
 <file path=customXml/item1.xml><?xml version="1.0" encoding="utf-8"?>
-<?mso-contentType ?>
-<FormTemplates xmlns="http://schemas.microsoft.com/sharepoint/v3/contenttype/forms">
-  <Display>DocumentLibraryForm</Display>
-  <Edit>DocumentLibraryForm</Edit>
-  <New>DocumentLibraryForm</New>
-</FormTemplates>
-</file>
-
-<file path=customXml/item2.xml><?xml version="1.0" encoding="utf-8"?>
 <ct:contentTypeSchema xmlns:ct="http://schemas.microsoft.com/office/2006/metadata/contentType" xmlns:ma="http://schemas.microsoft.com/office/2006/metadata/properties/metaAttributes" ct:_="" ma:_="" ma:contentTypeName="Asiakirja" ma:contentTypeID="0x01010017418C401CCB2042A3A99A19F43F356D" ma:contentTypeVersion="1" ma:contentTypeDescription="Luo uusi asiakirja." ma:contentTypeScope="" ma:versionID="f4b075d3ca74a5dbaed73e767a156aa0">
   <xsd:schema xmlns:xsd="http://www.w3.org/2001/XMLSchema" xmlns:p="http://schemas.microsoft.com/office/2006/metadata/properties" xmlns:ns1="http://schemas.microsoft.com/sharepoint/v3" targetNamespace="http://schemas.microsoft.com/office/2006/metadata/properties" ma:root="true" ma:fieldsID="4340a008e99365d80b71206bae222996" ns1:_="">
     <xsd:import namespace="http://schemas.microsoft.com/sharepoint/v3"/>
@@ -3538,6 +3395,15 @@
 </ct:contentTypeSchema>
 </file>
 
+<file path=customXml/item2.xml><?xml version="1.0" encoding="utf-8"?>
+<?mso-contentType ?>
+<FormTemplates xmlns="http://schemas.microsoft.com/sharepoint/v3/contenttype/forms">
+  <Display>DocumentLibraryForm</Display>
+  <Edit>DocumentLibraryForm</Edit>
+  <New>DocumentLibraryForm</New>
+</FormTemplates>
+</file>
+
 <file path=customXml/item3.xml><?xml version="1.0" encoding="utf-8"?>
 <p:properties xmlns:p="http://schemas.microsoft.com/office/2006/metadata/properties" xmlns:xsi="http://www.w3.org/2001/XMLSchema-instance" xmlns:pc="http://schemas.microsoft.com/office/infopath/2007/PartnerControls">
   <documentManagement>
@@ -3548,14 +3414,6 @@
 </file>
 
 <file path=customXml/itemProps1.xml><?xml version="1.0" encoding="utf-8"?>
-<ds:datastoreItem xmlns:ds="http://schemas.openxmlformats.org/officeDocument/2006/customXml" ds:itemID="{13FBD2FA-5696-460D-A278-9A302A0F72AE}">
-  <ds:schemaRefs>
-    <ds:schemaRef ds:uri="http://schemas.microsoft.com/sharepoint/v3/contenttype/forms"/>
-  </ds:schemaRefs>
-</ds:datastoreItem>
-</file>
-
-<file path=customXml/itemProps2.xml><?xml version="1.0" encoding="utf-8"?>
 <ds:datastoreItem xmlns:ds="http://schemas.openxmlformats.org/officeDocument/2006/customXml" ds:itemID="{B9A87442-5A7B-46FD-BD28-170CE9B7256F}">
   <ds:schemaRefs>
     <ds:schemaRef ds:uri="http://schemas.microsoft.com/office/2006/metadata/contentType"/>
@@ -3572,6 +3430,14 @@
 </ds:datastoreItem>
 </file>
 
+<file path=customXml/itemProps2.xml><?xml version="1.0" encoding="utf-8"?>
+<ds:datastoreItem xmlns:ds="http://schemas.openxmlformats.org/officeDocument/2006/customXml" ds:itemID="{13FBD2FA-5696-460D-A278-9A302A0F72AE}">
+  <ds:schemaRefs>
+    <ds:schemaRef ds:uri="http://schemas.microsoft.com/sharepoint/v3/contenttype/forms"/>
+  </ds:schemaRefs>
+</ds:datastoreItem>
+</file>
+
 <file path=customXml/itemProps3.xml><?xml version="1.0" encoding="utf-8"?>
 <ds:datastoreItem xmlns:ds="http://schemas.openxmlformats.org/officeDocument/2006/customXml" ds:itemID="{FA8F0064-303C-446D-896E-46EEB9A79DC3}">
   <ds:schemaRefs>

</xml_diff>